<commit_message>
Add second author + affiliations; Fable final-polish pass; harmonize numbers
- Authors: Alexander Apartsin (HIT) and Yehudit Aperstein (Afeka); superscript
  affiliations carried into HTML/DOCX/PDF.
- Fable editorial pass: fixed stale detector counts (nine-detector panel), the
  Limitations/5.7 deep-detector contradiction, VaDE-story consistency, and 8 prose/
  style fixes (no numbers/tables/refs altered by the agent).
- Resolved the numeric inconsistencies it flagged: harmonized the random-regret
  rounding (Table 5b -> canonical 5-seed 0.093/0.074/0.067), tabular fixed-ensemble
  0.022->0.021, clarified skill = per-dataset mean of 1-regret/random, and scoped the
  VaDE/global-tail clustering ablations to the 9-dataset DAMI subset (InternetAds
  excluded), which explains the 0.034 baseline and '6 of 9'.
- Rebuilt HTML + DOCX (both authors, 4 figs, 7 tables) + PDF (17pp); 21 refs valid.

Co-Authored-By: Claude Opus 4.7 <noreply@anthropic.com>
</commit_message>
<xml_diff>
--- a/docs/adrank.docx
+++ b/docs/adrank.docx
@@ -19,40 +19,107 @@
     <w:p>
       <w:pPr>
         <w:pStyle w:val="Subtitle"/>
-        <w:spacing w:before="0" w:after="40"/>
+        <w:spacing w:before="0" w:after="160"/>
         <w:jc w:val="center"/>
-        <w:keepNext/>
+        <w:keepNext w:val="0"/>
         <w:keepLines/>
         <w:widowControl w:val="1"/>
       </w:pPr>
       <w:r>
         <w:rPr>
           <w:rFonts w:ascii="Georgia" w:hAnsi="Georgia"/>
-          <w:b/>
-          <w:i w:val="0"/>
-          <w:sz w:val="24"/>
+          <w:b w:val="0"/>
+          <w:i/>
+          <w:sz w:val="20"/>
         </w:rPr>
         <w:t xml:space="preserve">Alexander Apartsin</w:t>
+      </w:r>
+      <w:r>
+        <w:rPr>
+          <w:rFonts w:ascii="Georgia" w:hAnsi="Georgia"/>
+          <w:b w:val="0"/>
+          <w:i/>
+          <w:sz w:val="20"/>
+          <w:vertAlign w:val="superscript"/>
+        </w:rPr>
+        <w:t xml:space="preserve">1</w:t>
+      </w:r>
+      <w:r>
+        <w:rPr>
+          <w:rFonts w:ascii="Georgia" w:hAnsi="Georgia"/>
+          <w:b w:val="0"/>
+          <w:i/>
+          <w:sz w:val="20"/>
+        </w:rPr>
+        <w:t xml:space="preserve">, Yehudit Aperstein</w:t>
+      </w:r>
+      <w:r>
+        <w:rPr>
+          <w:rFonts w:ascii="Georgia" w:hAnsi="Georgia"/>
+          <w:b w:val="0"/>
+          <w:i/>
+          <w:sz w:val="20"/>
+          <w:vertAlign w:val="superscript"/>
+        </w:rPr>
+        <w:t xml:space="preserve">2</w:t>
       </w:r>
     </w:p>
     <w:p>
       <w:pPr>
         <w:pStyle w:val="Subtitle"/>
-        <w:spacing w:before="0" w:after="40"/>
+        <w:spacing w:before="0" w:after="160"/>
         <w:jc w:val="center"/>
-        <w:keepNext/>
+        <w:keepNext w:val="0"/>
         <w:keepLines/>
         <w:widowControl w:val="1"/>
       </w:pPr>
       <w:r>
         <w:rPr>
-          <w:rStyle w:val="VerbatimChar"/>
           <w:rFonts w:ascii="Georgia" w:hAnsi="Georgia"/>
-          <w:b/>
-          <w:i w:val="0"/>
-          <w:sz w:val="24"/>
+          <w:b w:val="0"/>
+          <w:i/>
+          <w:sz w:val="20"/>
+          <w:vertAlign w:val="superscript"/>
         </w:rPr>
-        <w:t xml:space="preserve">apartsin@gmail.com</w:t>
+        <w:t xml:space="preserve">1</w:t>
+      </w:r>
+      <w:r>
+        <w:rPr>
+          <w:rFonts w:ascii="Georgia" w:hAnsi="Georgia"/>
+          <w:b w:val="0"/>
+          <w:i/>
+          <w:sz w:val="20"/>
+        </w:rPr>
+        <w:t xml:space="preserve">School of Computer Science, Faculty of Sciences, Holon Institute of Technology (HIT), Holon, Israel</w:t>
+      </w:r>
+    </w:p>
+    <w:p>
+      <w:pPr>
+        <w:pStyle w:val="Subtitle"/>
+        <w:spacing w:before="0" w:after="160"/>
+        <w:jc w:val="center"/>
+        <w:keepNext w:val="0"/>
+        <w:keepLines/>
+        <w:widowControl w:val="1"/>
+      </w:pPr>
+      <w:r>
+        <w:rPr>
+          <w:rFonts w:ascii="Georgia" w:hAnsi="Georgia"/>
+          <w:b w:val="0"/>
+          <w:i/>
+          <w:sz w:val="20"/>
+          <w:vertAlign w:val="superscript"/>
+        </w:rPr>
+        <w:t xml:space="preserve">2</w:t>
+      </w:r>
+      <w:r>
+        <w:rPr>
+          <w:rFonts w:ascii="Georgia" w:hAnsi="Georgia"/>
+          <w:b w:val="0"/>
+          <w:i/>
+          <w:sz w:val="20"/>
+        </w:rPr>
+        <w:t xml:space="preserve">Intelligent Systems, Afeka Academic College of Engineering, Tel-Aviv, Israel</w:t>
       </w:r>
     </w:p>
     <w:p>
@@ -362,7 +429,7 @@
         <w:t xml:space="preserve"> </w:t>
       </w:r>
       <w:r>
-        <w:t xml:space="preserve">The detectors we rank span the standard families: isolation-based (Isolation Forest [8]), density-based (LOF [9]), boundary-based (one-class SVM [10]), distribution-based (COPOD [11], ECOD [12]), projection-based (LODA [13], PCA), and deep one-class methods (DeepSVDD [14]). Comprehensive surveys [15] and empirical studies [16] document that no single detector dominates across datasets, which is exactly what makes per-dataset selection necessary. Standardized benchmarks, ODDS-derived collections and their consolidation in ADBench [5], and the PyOD toolbox [6] make large-scale comparison feasible; we build directly on both.</w:t>
+        <w:t xml:space="preserve">Established detectors span the standard families: isolation-based (Isolation Forest [8]), density-based (LOF [9]), boundary-based (one-class SVM [10]), distribution-based (COPOD [11], ECOD [12]), projection-based (LODA [13], PCA), and deep one-class methods (DeepSVDD [14]). Comprehensive surveys [15] and empirical studies [16] document that no single detector dominates across datasets, which is exactly what makes per-dataset selection necessary. Standardized benchmarks, ODDS-derived collections and their consolidation in ADBench [5], and the PyOD toolbox [6] make large-scale comparison feasible; we build directly on both.</w:t>
       </w:r>
     </w:p>
     <w:p>
@@ -5719,7 +5786,7 @@
         <w:widowControl w:val="1"/>
       </w:pPr>
       <w:r>
-        <w:t xml:space="preserve">We recompute ADRank ρ using only 9 of the 10 detectors, dropping each one in turn (Table 3). Baseline ρ = 0.599 on the spread ≥ 0.10 subset with all 10.</w:t>
+        <w:t xml:space="preserve">The drop-one analysis runs on the original 10-detector panel (the nine detectors of Section 4 plus OCSVM): we recompute ADRank ρ using only 9 of the 10 detectors, dropping each one in turn (Table 3). Baseline ρ = 0.599 on the spread ≥ 0.10 subset with all 10.</w:t>
       </w:r>
     </w:p>
     <w:tbl>
@@ -6772,7 +6839,7 @@
         <w:widowControl w:val="1"/>
       </w:pPr>
       <w:r>
-        <w:t xml:space="preserve">The ranking is stable to detector-panel choice. Dropping the strongest single detector (IForest) is the largest cost and still leaves ρ = 0.557, above the consensus baseline by ~0.7. Removing OCSVM or HBOS improves ρ marginally, suggesting they contribute more noise than signal to the pseudo-ranking under this panel and dataset mix.</w:t>
+        <w:t xml:space="preserve">The ranking is stable to detector-panel choice. Dropping the strongest single detector (IForest) is the largest cost and still leaves ρ = 0.557, above the consensus baseline by ~0.7. Removing OCSVM or HBOS improves ρ marginally, indicating they contribute more noise than signal to the pseudo-ranking under this panel and dataset mix; the OCSVM row is the panel-removal check referenced in Section 4.</w:t>
       </w:r>
     </w:p>
     <w:bookmarkEnd w:id="22"/>
@@ -7030,7 +7097,7 @@
         <w:t xml:space="preserve">TS</w:t>
       </w:r>
       <w:r>
-        <w:t xml:space="preserve">). 10 synthetic univariate series (length 10 000 each) covering point-spike, subsequence, trend, amplitude, frequency-shift, and mixed anomaly types. Each series is windowed (window = 64, stride = 16) and each window is described by a 28-dimensional feature vector spanning time-domain statistics, first- and second-difference statistics, autocorrelation at several lags, distribution shape (skew, kurtosis, quantiles, IQR, zero-crossing rate), and spectral features (entropy, crest factor, dominant frequency, per-band energy). Section 5.5 reports the effect of this representation choice.</w:t>
+        <w:t xml:space="preserve">). 10 synthetic univariate series (length 10 000 each) covering point-spike, subsequence, trend, amplitude, frequency-shift, and mixed anomaly types. Each series is windowed (window = 64, stride = 16) and each window is described by a 28-dimensional feature vector spanning time-domain statistics, first- and second-difference statistics, autocorrelation at several lags, distribution shape (skew, kurtosis, quantiles, IQR, zero-crossing rate), and spectral features (entropy, crest factor, dominant frequency, per-band energy). The effect of this representation choice is reported below.</w:t>
       </w:r>
     </w:p>
     <w:tbl>
@@ -8302,7 +8369,7 @@
         <w:t xml:space="preserve">77% on tabular, 81% on images, and 90% on time-series</w:t>
       </w:r>
       <w:r>
-        <w:t xml:space="preserve">. On all three the chosen detector is within ~2 AUC points of the best available, and the seed standard deviation is at or below 0.004, so the selection is stable. Text is the exception and the method's honest weak spot: on BERT embeddings the regret reduction is only 21% (0.065 vs 0.082), and the thresholded Spearman for text is both low and unstable (0.41 ± 0.17). The instability is diagnostic, not a property of the ranking itself: several NLP datasets sit near the spread = 0.10 boundary, so they cross it under small seed perturbations and swing the thresholded mean while the underlying regret stays put. This is exactly why we report regret as primary.</w:t>
+        <w:t xml:space="preserve">. On all three the chosen detector is within ~2 AUC points of the best available, and the seed standard deviation is at or below 0.004, so the selection is stable. Text is the exception and the method's weak spot under a fixed regime: on BERT embeddings the regret reduction is only 21% (0.065 vs 0.082), and the thresholded Spearman for text is both low and unstable (0.41 ± 0.17). The instability is diagnostic, not a property of the ranking itself: several NLP datasets sit near the spread = 0.10 boundary, so they cross it under small seed perturbations and swing the thresholded mean while the underlying regret stays put. This is exactly why we report regret as primary.</w:t>
       </w:r>
     </w:p>
     <w:p>
@@ -8724,7 +8791,7 @@
                 <w:rFonts w:ascii="Georgia" w:hAnsi="Georgia"/>
                 <w:sz w:val="19"/>
               </w:rPr>
-              <w:t xml:space="preserve">0.022 ± 0.002</w:t>
+              <w:t xml:space="preserve">0.021 ± 0.003</w:t>
             </w:r>
           </w:p>
         </w:tc>
@@ -9555,7 +9622,7 @@
         <w:t xml:space="preserve"> </w:t>
       </w:r>
       <w:r>
-        <w:t xml:space="preserve">Table 5b sets ADRank against the canonical Excess-Mass and Mass-Volume internal metrics [1], on the same datasets and true rankings. ADRank has lower regret than both EM and MV on every modality. EM and MV are also unreliable: on image embeddings and on DAMI they collapse to or below the random-pick baseline (EM 0.078 vs random 0.073 on images; 0.074 vs 0.068 on DAMI), whereas ADRank stays well above random everywhere. The skill column, the fraction of the achievable-over-random improvement that ADRank captures, ranges from 0.88 on images to 0.24 on the hard DAMI benchmark.</w:t>
+        <w:t xml:space="preserve">Table 5b sets ADRank against the canonical Excess-Mass and Mass-Volume internal metrics [1], on the same datasets and true rankings. ADRank has lower regret than both EM and MV on every modality. EM and MV are also unreliable: on image embeddings and on DAMI they collapse to or below the random-pick baseline (EM 0.078 vs random 0.074 on images; 0.074 vs 0.067 on DAMI), whereas ADRank stays well above random everywhere. The skill column, the fraction of the achievable-over-random improvement that ADRank captures, ranges from 0.88 on images to 0.24 on the hard DAMI benchmark.</w:t>
       </w:r>
     </w:p>
     <w:tbl>
@@ -9948,7 +10015,7 @@
                 <w:rFonts w:ascii="Georgia" w:hAnsi="Georgia"/>
                 <w:sz w:val="18"/>
               </w:rPr>
-              <w:t xml:space="preserve">0.092</w:t>
+              <w:t xml:space="preserve">0.093</w:t>
             </w:r>
           </w:p>
         </w:tc>
@@ -10155,7 +10222,7 @@
                 <w:rFonts w:ascii="Georgia" w:hAnsi="Georgia"/>
                 <w:sz w:val="18"/>
               </w:rPr>
-              <w:t xml:space="preserve">0.073</w:t>
+              <w:t xml:space="preserve">0.074</w:t>
             </w:r>
           </w:p>
         </w:tc>
@@ -10776,7 +10843,7 @@
                 <w:rFonts w:ascii="Georgia" w:hAnsi="Georgia"/>
                 <w:sz w:val="18"/>
               </w:rPr>
-              <w:t xml:space="preserve">0.068</w:t>
+              <w:t xml:space="preserve">0.067</w:t>
             </w:r>
           </w:p>
         </w:tc>
@@ -10862,7 +10929,118 @@
         <w:t xml:space="preserve"> </w:t>
       </w:r>
       <w:r>
-        <w:t xml:space="preserve">regret@1 (absolute AUC points; lower is better) for ADRank versus label-free baselines. EM/MV are the Goix internal metrics, estimated by scoring both the data and a uniform Monte-Carlo sample of the feature box with each fitted detector. Consensus (rank by agreement with the mean detector score) scores Spearman ρ = -0.15 on tabular and is worse than random; its regret is dominated by that failure and omitted here for brevity. "skill" = 1 − regret/random, the fraction of achievable improvement ADRank captures. ADRank is lowest on every row, and unlike EM/MV never falls to the random baseline.</w:t>
+        <w:t xml:space="preserve">regret@1 (absolute AUC points; lower is better) for ADRank versus label-free baselines. EM/MV are the Goix internal metrics, estimated by scoring both the data and a uniform Monte-Carlo sample of the feature box with each fitted detector. Consensus (rank by agreement with the mean detector score) scores Spearman ρ = -0.15 on tabular and is worse than random; its regret is dominated by that failure and omitted here for brevity. "skill" is the per-dataset mean of</w:t>
+      </w:r>
+      <w:r>
+        <w:t xml:space="preserve"> </w:t>
+      </w:r>
+      <m:oMath>
+        <m:r>
+          <m:t>1</m:t>
+        </m:r>
+        <m:r>
+          <m:rPr>
+            <m:sty m:val="p"/>
+          </m:rPr>
+          <m:t>−</m:t>
+        </m:r>
+        <m:r>
+          <m:rPr>
+            <m:sty m:val="p"/>
+          </m:rPr>
+          <m:t>r</m:t>
+        </m:r>
+        <m:r>
+          <m:rPr>
+            <m:sty m:val="p"/>
+          </m:rPr>
+          <m:t>e</m:t>
+        </m:r>
+        <m:r>
+          <m:rPr>
+            <m:sty m:val="p"/>
+          </m:rPr>
+          <m:t>g</m:t>
+        </m:r>
+        <m:r>
+          <m:rPr>
+            <m:sty m:val="p"/>
+          </m:rPr>
+          <m:t>r</m:t>
+        </m:r>
+        <m:r>
+          <m:rPr>
+            <m:sty m:val="p"/>
+          </m:rPr>
+          <m:t>e</m:t>
+        </m:r>
+        <m:r>
+          <m:rPr>
+            <m:sty m:val="p"/>
+          </m:rPr>
+          <m:t>t</m:t>
+        </m:r>
+        <m:r>
+          <m:rPr>
+            <m:sty m:val="p"/>
+          </m:rPr>
+          <m:t>/</m:t>
+        </m:r>
+        <m:sSub>
+          <m:e>
+            <m:r>
+              <m:rPr>
+                <m:sty m:val="p"/>
+              </m:rPr>
+              <m:t>r</m:t>
+            </m:r>
+            <m:r>
+              <m:rPr>
+                <m:sty m:val="p"/>
+              </m:rPr>
+              <m:t>e</m:t>
+            </m:r>
+            <m:r>
+              <m:rPr>
+                <m:sty m:val="p"/>
+              </m:rPr>
+              <m:t>g</m:t>
+            </m:r>
+            <m:r>
+              <m:rPr>
+                <m:sty m:val="p"/>
+              </m:rPr>
+              <m:t>r</m:t>
+            </m:r>
+            <m:r>
+              <m:rPr>
+                <m:sty m:val="p"/>
+              </m:rPr>
+              <m:t>e</m:t>
+            </m:r>
+            <m:r>
+              <m:rPr>
+                <m:sty m:val="p"/>
+              </m:rPr>
+              <m:t>t</m:t>
+            </m:r>
+          </m:e>
+          <m:sub>
+            <m:r>
+              <m:rPr>
+                <m:nor/>
+                <m:sty m:val="p"/>
+              </m:rPr>
+              <m:t>random</m:t>
+            </m:r>
+          </m:sub>
+        </m:sSub>
+      </m:oMath>
+      <w:r>
+        <w:t xml:space="preserve"> </w:t>
+      </w:r>
+      <w:r>
+        <w:t xml:space="preserve">(Section 4), the fraction of achievable improvement ADRank captures; it is a mean of per-dataset ratios and so differs from one minus the ratio of the column means. ADRank is lowest on every row, and unlike EM/MV never falls to the random baseline.</w:t>
       </w:r>
     </w:p>
     <w:bookmarkEnd w:id="31"/>
@@ -11609,7 +11787,7 @@
         <w:t xml:space="preserve">local</w:t>
       </w:r>
       <w:r>
-        <w:t xml:space="preserve">. ADRank picks a local-density detector (LOF/KNN/CBLOF) on 98% of DAMI cells, but the true best is local on only 48%; when the true best is a global detector (HBOS/COPOD/ECOD/PCA), no cluster-based regime in the bank can make it win, and the oracle-in-bank regret on those cells (0.039) is 5× that on local-best cells (0.008). The natural remedy, adding a global-tail pseudo-anomaly regime (points in the marginal tails or far from the centroid, rather than held-out clusters), does not help and slightly hurts: DAMI regret rises from 0.034 to 0.036-0.045 as such regimes are added. The mechanism is instructive: a global-tail task is high-variance (marginal detectors ace it), so the discriminative weight over-trusts it, but it is not truth-aligned, so it drags the pick toward marginal detectors even when they are wrong. The label-free weighting cannot distinguish a high-variance-but-misaligned regime from an informative one. A second candidate fix, replacing the PCA-then-MiniBatchKMeans latent and clustering with a jointly-learned deep clustering (VaDE [21], a variational autoencoder with a Gaussian-mixture prior), is more subtle and instructive. Off-the-shelf VaDE does raise regret (mean 0.056 vs 0.047 for k-means on the four ceiling datasets), but for a diagnosable reason rather than a fundamental one: with only 5-30 features the summed reconstruction term swamps the mixture clustering terms in the ELBO, so default VaDE degrades to an autoencoder with a weak mixture. Down-weighting the reconstruction so the clustering terms carry weight reverses this on the ceiling datasets (mean 0.041 vs 0.047, winning on WDBC 0.064 to 0.044 and PageBlocks 0.008 to 0.000). Across the full DAMI set, however, the balanced VaDE is not a robust replacement: it improves 6 of 9 datasets by small margins but collapses to two or three effective clusters on others and then makes a catastrophic pick (Wilt 0.000 to 0.193, Waveform 0.016 to 0.075), so its mean regret is worse than k-means (0.055 vs 0.034). The latent and clustering are therefore a partial lever, contrary to a first reading of the default-VaDE result: a better-balanced deep clustering helps where the ceiling bites, but trades median gains for tail risk and is not a reliable drop-in. Closing the ceiling robustly needs a pseudo-anomaly regime that is both global and truth-aligned, a label-free trust signal for regimes, or a deep clustering constrained against collapse, which we leave open. A partial such signal already exists: cross-regime top-1 agreement predicts realized regret on the hard (DAMI, tabular) datasets (high-agreement half 0.030 vs 0.049), giving a per-dataset confidence flag.</w:t>
+        <w:t xml:space="preserve">. ADRank picks a local-density detector (LOF/KNN/CBLOF) on 98% of DAMI cells, but the true best is local on only 48%; when the true best is a global detector (HBOS/COPOD/ECOD/PCA), no cluster-based regime in the bank can make it win, and the oracle-in-bank regret on those cells (0.039) is 5× that on local-best cells (0.008). The two clustering ablations that follow (global-tail regime and deep clustering) run on the nine DAMI datasets that exclude the 1555-dimensional InternetAds, on which k-means auto-calibrated regret is 0.034. The natural remedy, adding a global-tail pseudo-anomaly regime (points in the marginal tails or far from the centroid, rather than held-out clusters), does not help and slightly hurts: DAMI regret rises from 0.034 to 0.036-0.045 as such regimes are added. The mechanism is instructive: a global-tail task is high-variance (marginal detectors ace it), so the discriminative weight over-trusts it, but it is not truth-aligned, so it drags the pick toward marginal detectors even when they are wrong. The label-free weighting cannot distinguish a high-variance-but-misaligned regime from an informative one. A second candidate fix, replacing the PCA-then-MiniBatchKMeans latent and clustering with a jointly-learned deep clustering (VaDE [21], a variational autoencoder with a Gaussian-mixture prior), is more subtle and instructive. Off-the-shelf VaDE does raise regret (mean 0.056 vs 0.047 for k-means on the four ceiling datasets), but for a diagnosable reason rather than a fundamental one: with only 5-30 features the summed reconstruction term swamps the mixture clustering terms in the ELBO, so default VaDE degrades to an autoencoder with a weak mixture. Down-weighting the reconstruction so the clustering terms carry weight reverses this on the ceiling datasets (mean 0.041 vs 0.047, winning on WDBC 0.064 to 0.044 and PageBlocks 0.008 to 0.000). Across the full DAMI set, however, the balanced VaDE is not a robust replacement: it improves 6 of 9 datasets by small margins but collapses to two or three effective clusters on others and then makes a catastrophic pick (Wilt 0.000 to 0.193, Waveform 0.016 to 0.075), so its mean regret is worse than k-means (0.055 vs 0.034). The latent and clustering are therefore a partial lever, contrary to a first reading of the default-VaDE result: a better-balanced deep clustering helps where the ceiling bites, but trades median gains for tail risk and is not a reliable drop-in. Closing the ceiling robustly needs a pseudo-anomaly regime that is both global and truth-aligned, a label-free trust signal for regimes, or a deep clustering constrained against collapse, which we leave open. A partial such signal already exists: cross-regime top-1 agreement predicts realized regret on the hard (DAMI, tabular) datasets (high-agreement half 0.030 vs 0.049), giving a per-dataset confidence flag.</w:t>
       </w:r>
     </w:p>
     <w:bookmarkEnd w:id="32"/>
@@ -11645,7 +11823,7 @@
         <w:t xml:space="preserve"> </w:t>
       </w:r>
       <w:r>
-        <w:t xml:space="preserve">Our first evaluation used thresholded Spearman ρ and produced a text result that swung from 0.68 to 0.34 between configurations. Investigation showed the rankings were stable; what moved was the set of datasets above the spread = 0.10 cutoff, several of which sit right at the boundary. Regret removes the cutoff entirely: a dataset on which all detectors tie contributes ≈ 0 regret regardless of the pick, so it neither inflates nor deflates the aggregate. Under regret the seed-to-seed standard deviation is ≤ 0.017 everywhere, and the honest ordering of modalities (time-series and image best, tabular close, text weak) is stable. The lesson generalizes to any unsupervised model-selection study: report a decision-relevant, threshold-free loss rather than a rank correlation gated on a hand-set cutoff.</w:t>
+        <w:t xml:space="preserve">Our first evaluation used thresholded Spearman ρ and produced a text result that swung from 0.68 to 0.34 between configurations. Investigation showed the rankings were stable; what moved was the set of datasets above the spread = 0.10 cutoff, several of which sit right at the boundary. Regret removes the cutoff entirely: a dataset on which all detectors tie contributes ≈ 0 regret regardless of the pick, so it neither inflates nor deflates the aggregate. Under regret the seed-to-seed standard deviation is ≤ 0.017 everywhere, and the ordering of modalities (time-series and image best, tabular close, text weak under a fixed regime) is stable. The lesson generalizes to any unsupervised model-selection study: report a decision-relevant, threshold-free loss rather than a rank correlation gated on a hand-set cutoff.</w:t>
       </w:r>
     </w:p>
     <w:p>
@@ -11667,7 +11845,7 @@
         <w:t xml:space="preserve"> </w:t>
       </w:r>
       <w:r>
-        <w:t xml:space="preserve">With auto-calibration the method selects a near-best detector on all four modalities (regret@1 ≤ 0.020, 78–93% below random, within a few thousandths of the labels-based oracle). The one modality that a fixed regime under-served, text, is brought in line by the same label-free weighting, so there is no longer a modality on which ADRank fails. The remaining gap to the oracle is small and is largest on tabular data, where a few datasets have genuinely ambiguous best detectors.</w:t>
+        <w:t xml:space="preserve">With auto-calibration the method selects a near-best detector on all four modalities (regret@1 ≤ 0.020, 78–93% below random, within a few thousandths of the labels-based oracle). The one modality that a fixed regime under-served, text, is brought in line by the same label-free weighting, so there is no longer a modality on which ADRank fails. The remaining gap to the oracle is small on the four primary modalities and largest on tabular data, where a few datasets have genuinely ambiguous best detectors; on the DAMI benchmark the gap is larger, and Section 5.7 traces its structural cause.</w:t>
       </w:r>
     </w:p>
     <w:p>
@@ -11689,7 +11867,7 @@
         <w:t xml:space="preserve"> </w:t>
       </w:r>
       <w:r>
-        <w:t xml:space="preserve">A regime whose pseudo-AUC is nearly constant across detectors cannot rank them; its high-variance counterpart can. Weighting by cross-detector variance therefore trusts the regimes that carry a ranking signal and ignores the rest, and because a locally-embedded ("hard") regime is the one that separates local from global density detectors, the weighting recovers the local-density winner on text without being told to look for it. This is an empirical alignment, not a guarantee: a regime could in principle discriminate detectors in a direction anti-correlated with truth, but across 69 datasets the high-variance regimes were the trustworthy ones.</w:t>
+        <w:t xml:space="preserve">A regime whose pseudo-AUC is nearly constant across detectors cannot rank them; its high-variance counterpart can. Weighting by cross-detector variance therefore trusts the regimes that carry a ranking signal and ignores the rest, and because a locally-embedded ("hard") regime is the one that separates local from global density detectors, the weighting recovers the local-density winner on text without being told to look for it. This is an empirical alignment, not a guarantee: a regime could in principle discriminate detectors in a direction anti-correlated with truth, and Section 5.7 exhibits exactly that failure for a global-tail regime outside the cluster-holdout bank; within the bank, across 69 datasets, the high-variance regimes were the trustworthy ones.</w:t>
       </w:r>
     </w:p>
     <w:p>
@@ -11733,7 +11911,7 @@
         <w:t xml:space="preserve"> </w:t>
       </w:r>
       <w:r>
-        <w:t xml:space="preserve">One ADRank pass over ten detectors, 20 cluster draws, and one dataset takes seconds to minutes on CPU. The whole 26-dataset tabular benchmark runs in ~35 minutes. There is no meta-training, no GPU dependency, and no external service.</w:t>
+        <w:t xml:space="preserve">One ADRank pass over nine detectors, 20 cluster draws, and one dataset takes seconds to minutes on CPU. The whole 26-dataset tabular benchmark runs in ~35 minutes. There is no meta-training, no GPU dependency, and no external service.</w:t>
       </w:r>
     </w:p>
     <w:bookmarkEnd w:id="34"/>
@@ -11770,7 +11948,7 @@
         <w:t xml:space="preserve">smallest</w:t>
       </w:r>
       <w:r>
-        <w:t xml:space="preserve">-cluster selection degrades and the smallest+random ensemble is needed, and on time-series a richer window descriptor is needed than a handful of summary statistics. The evaluation uses fixed default hyperparameters per detector; combining ADRank with per-detector hyperparameter search is left to future work. Deep detectors (AutoEncoder, DeepSVDD) are absent from the panel for CPU-only reproducibility, though they add without changing the procedure. Confidence intervals are derived from five seeds; regret standard deviations are already small (≤ 0.017), so more seeds would tighten them marginally without changing the ordering of modalities.</w:t>
+        <w:t xml:space="preserve">-cluster selection degrades and the smallest+random ensemble is needed, and on time-series a richer window descriptor is needed than a handful of summary statistics. The evaluation uses fixed default hyperparameters per detector; combining ADRank with per-detector hyperparameter search is left to future work. The default panel is classical for CPU-only reproducibility; deep detectors (AutoEncoder, DeepSVDD) are validated in a single-seed spot-check (Section 5.7) rather than the full five-seed sweep. Confidence intervals are derived from five seeds; regret standard deviations are already small (≤ 0.017), so more seeds would tighten them marginally without changing the ordering of modalities.</w:t>
       </w:r>
     </w:p>
     <w:bookmarkEnd w:id="35"/>
@@ -11795,7 +11973,7 @@
         <w:widowControl w:val="1"/>
       </w:pPr>
       <w:r>
-        <w:t xml:space="preserve">Clusters of the unlabeled training distribution behave, for the purpose of ranking anomaly detectors, close enough to real anomalies. Running a bank of pseudo-anomaly regimes and weighting each by how strongly it separates the detectors, a purely label-free signal, cuts detector-selection regret to 78–93% below random on tabular, image, text, and time-series data, within a few thousandths of AUC of a labels-based oracle, with a seed standard deviation at or below 0.002. Evaluated by regret, a threshold-free and decision-relevant loss, the result is stable where thresholded rank-correlation is not, and the auto-calibration removes the text weak spot that a single fixed regime leaves behind. The method needs no labels, no meta-training, and no GPU. It gives practitioners a cheap, unsupervised, self-calibrating selector for an anomaly detector, together with an evaluation protocol that reports its reliability honestly.</w:t>
+        <w:t xml:space="preserve">Clusters of the unlabeled training distribution behave, for the purpose of ranking anomaly detectors, close enough to real anomalies. Running a bank of pseudo-anomaly regimes and weighting each by how strongly it separates the detectors, a purely label-free signal, cuts detector-selection regret to 78–93% below random on tabular, image, text, and time-series data, within a few thousandths of AUC of a labels-based oracle, with a seed standard deviation at or below 0.002. Evaluated by regret, a threshold-free and decision-relevant loss, the result is stable where thresholded rank-correlation is not, and the auto-calibration removes the text weak spot that a single fixed regime leaves behind. The method needs no labels, no meta-training, and no GPU. It gives practitioners a cheap, unsupervised, self-calibrating selector for an anomaly detector, together with an evaluation protocol that measures its reliability directly.</w:t>
       </w:r>
     </w:p>
     <w:bookmarkEnd w:id="36"/>

</xml_diff>

<commit_message>
Add marginal-tail regime: partial fix for the global-best ceiling
A per-feature marginal-tail pseudo-anomaly regime (hold out the extreme tail of a
single raw feature) reduces regret where the best detector is marginal, without the
over-trust failure of the earlier centroid-distance global-tail regime.

- Safe in-distribution: no ADBench or DAMI dataset among 32 worsens by >0.001
- Significant out-of-distribution: 164 held-out OddBench datasets, mean regret
  0.102 -> 0.090 (paired p=0.006), concentrated on the global-best losers (0.228->0.196)
- Neutral on distributional-global datasets (DAMI Annthyroid/WDBC unchanged), so that
  part of the ceiling stays open; no contradiction with the global-tail negative
- Woven into Sec 5.7, Sec 7 limitations, and the abstract ceiling sentence
- scripts/modal_reconcile.py: the in-distribution reconciliation experiment

Co-Authored-By: Claude Opus 4.8 <noreply@anthropic.com>
</commit_message>
<xml_diff>
--- a/docs/adrank.docx
+++ b/docs/adrank.docx
@@ -196,7 +196,7 @@
         <w:t xml:space="preserve">regret</w:t>
       </w:r>
       <w:r>
-        <w:t xml:space="preserve">: the true-AUC gap between the best detector in the panel and the one the selector picks, a threshold-free, decision-relevant quantity that stays well-behaved when detectors tie. An unsupervised auto-calibration removes the one weak spot a single fixed regime leaves on text: run a bank of pseudo-anomaly regimes and weight each by how strongly it separates the detectors, a purely label-free signal. Across four modalities and 69 anomaly-detection tasks drawn from a smaller number of source corpora, with five seeds, auto-calibrated ADRank cuts detector-selection regret relative to random selection by 78% on tabular ADBench data, 93% on ResNet-18 image embeddings, 93% on BERT text embeddings, and 90% on windowed time-series, matching within 0.01 of AUC, on these modalities, an oracle that picks the best regime using labels. Measured against the harder baseline of a single fixed detector, ADRank beats the common Isolation Forest default significantly on image, text, and tabular data (paired p &lt; 0.05, and p &lt; 0.001 on the two embedding modalities) and matches the strongest fixed detector in the panel without knowing in advance which one that is. Frozen and run on 187 previously-unseen OddBench datasets, it has the lowest mean regret of any label-free strategy, below all nine fixed detectors, and ties that benchmark's best fixed detector; because the best fixed detector differs between benchmarks, no detector chosen in advance is safe across them. The result transfers to a separately preprocessed tabular benchmark (DAMI, 41% regret reduction) and survives adding deep detectors (AutoEncoder, DeepSVDD) to the panel. By a paired test ADRank beats the canonical Excess-Mass and Mass-Volume internal metrics significantly where their high-dimensional estimate breaks (image embeddings) and matches them on tabular and text; unlike them it never falls to the random-pick baseline, and the consensus heuristic is itself worse than random. ADRank is stable across seeds (regret standard deviation ≤ 0.002 after calibration), stable under drop-one detector-panel perturbations, and cheap to compute. We characterize its ceiling: because cluster-holdout pseudo-anomalies are local, the method under-serves datasets whose best detector is global; a label-free collapse guard makes a deep-clustering latent a reliable lever where the ceiling bites, while a full fix for global-best datasets remains open. We release the code, benchmark harness, and per-dataset results.</w:t>
+        <w:t xml:space="preserve">: the true-AUC gap between the best detector in the panel and the one the selector picks, a threshold-free, decision-relevant quantity that stays well-behaved when detectors tie. An unsupervised auto-calibration removes the one weak spot a single fixed regime leaves on text: run a bank of pseudo-anomaly regimes and weight each by how strongly it separates the detectors, a purely label-free signal. Across four modalities and 69 anomaly-detection tasks drawn from a smaller number of source corpora, with five seeds, auto-calibrated ADRank cuts detector-selection regret relative to random selection by 78% on tabular ADBench data, 93% on ResNet-18 image embeddings, 93% on BERT text embeddings, and 90% on windowed time-series, matching within 0.01 of AUC, on these modalities, an oracle that picks the best regime using labels. Measured against the harder baseline of a single fixed detector, ADRank beats the common Isolation Forest default significantly on image, text, and tabular data (paired p &lt; 0.05, and p &lt; 0.001 on the two embedding modalities) and matches the strongest fixed detector in the panel without knowing in advance which one that is. Frozen and run on 187 previously-unseen OddBench datasets, it has the lowest mean regret of any label-free strategy, below all nine fixed detectors, and ties that benchmark's best fixed detector; because the best fixed detector differs between benchmarks, no detector chosen in advance is safe across them. The result transfers to a separately preprocessed tabular benchmark (DAMI, 41% regret reduction) and survives adding deep detectors (AutoEncoder, DeepSVDD) to the panel. By a paired test ADRank beats the canonical Excess-Mass and Mass-Volume internal metrics significantly where their high-dimensional estimate breaks (image embeddings) and matches them on tabular and text; unlike them it never falls to the random-pick baseline, and the consensus heuristic is itself worse than random. ADRank is stable across seeds (regret standard deviation ≤ 0.002 after calibration), stable under drop-one detector-panel perturbations, and cheap to compute. We characterize its ceiling: because cluster-holdout pseudo-anomalies are local, the method under-serves datasets whose best detector is global; a per-feature marginal-tail regime, safe in distribution, closes the marginal part of this gap (on 164 held-out datasets, 0.102 to 0.090, p = 0.006), while datasets whose best detector is distributional remain open. We release the code, benchmark harness, and per-dataset results.</w:t>
       </w:r>
     </w:p>
     <w:bookmarkEnd w:id="9"/>
@@ -11828,7 +11828,7 @@
         <w:t xml:space="preserve">local</w:t>
       </w:r>
       <w:r>
-        <w:t xml:space="preserve">. ADRank picks a local-density detector (LOF/KNN/CBLOF) on 98% of DAMI cells, but the true best is local on only 48%; when the true best is a global detector (HBOS/COPOD/ECOD/PCA), no cluster-based regime in the bank can make it win, and the oracle-in-bank regret on those cells (0.039) is 5× that on local-best cells (0.008). The two clustering ablations that follow (global-tail regime and deep clustering) run on the nine DAMI datasets that exclude the 1555-dimensional InternetAds, on which k-means auto-calibrated regret is 0.034. The natural remedy, adding a global-tail pseudo-anomaly regime (points in the marginal tails or far from the centroid, rather than held-out clusters), does not help and slightly hurts: DAMI regret rises from 0.034 to 0.036-0.045 as such regimes are added. The mechanism is instructive: a global-tail task is high-variance (marginal detectors ace it), so the discriminative weight over-trusts it, but it is not truth-aligned, so it drags the pick toward marginal detectors even when they are wrong. The label-free weighting cannot distinguish a high-variance-but-misaligned regime from an informative one. A second candidate fix, replacing the PCA-then-MiniBatchKMeans latent and clustering with a jointly-learned deep clustering (VaDE [21], a variational autoencoder with a Gaussian-mixture prior), is more subtle and instructive. Off-the-shelf VaDE does raise regret (mean 0.056 vs 0.047 for k-means on the four ceiling datasets), but for a diagnosable reason rather than a fundamental one: with only 5-30 features the summed reconstruction term swamps the mixture clustering terms in the ELBO, so default VaDE degrades to an autoencoder with a weak mixture. Down-weighting the reconstruction so the clustering terms carry weight reverses this on the ceiling datasets (mean 0.041 vs 0.047, winning on WDBC 0.064 to 0.044 and PageBlocks 0.008 to 0.000). Across the full DAMI set, unguarded balanced VaDE is not a robust replacement: it improves 6 of 9 datasets by small margins but collapses to two or three effective clusters on others and then makes a catastrophic pick (Wilt 0.000 to 0.193, Waveform 0.016 to 0.075), so its mean regret is worse than k-means (0.055 vs 0.034). The collapse is label-free-detectable, however: VaDE resolves only two to three effective clusters (effK) precisely on the datasets it ruins (Wilt effK = 2.5, Waveform 2.8), while the datasets it helps sit at effK ≥ 3. Gating on this, using the deep clustering only when effK ≥ 3 and falling back to k-means otherwise, removes both catastrophes (Wilt 0.193 to 0.000, Waveform 0.075 to 0.016) and gives mean regret 0.030, below both k-means (0.034) and unguarded VaDE (0.055). A better-balanced deep clustering with this collapse guard is therefore a reliable lever: it helps where the ceiling bites, and its one failure mode is observable without labels. The remaining ceiling, datasets whose true-best detector is a global method, still needs a pseudo-anomaly regime that is both global and truth-aligned, or a label-free trust signal for regimes, which we leave open. A partial such signal already exists: cross-regime top-1 agreement predicts realized regret on the hard (DAMI, tabular) datasets (high-agreement half 0.030 vs 0.049), giving a per-dataset confidence flag.</w:t>
+        <w:t xml:space="preserve">. ADRank picks a local-density detector (LOF/KNN/CBLOF) on 98% of DAMI cells, but the true best is local on only 48%; when the true best is a global detector (HBOS/COPOD/ECOD/PCA), no cluster-based regime in the bank can make it win, and the oracle-in-bank regret on those cells (0.039) is 5× that on local-best cells (0.008). The two clustering ablations that follow (global-tail regime and deep clustering) run on the nine DAMI datasets that exclude the 1555-dimensional InternetAds, on which k-means auto-calibrated regret is 0.034. The natural remedy, adding a global-tail pseudo-anomaly regime (points in the marginal tails or far from the centroid, rather than held-out clusters), does not help and slightly hurts: DAMI regret rises from 0.034 to 0.036-0.045 as such regimes are added. The mechanism is instructive: a global-tail task is high-variance (marginal detectors ace it), so the discriminative weight over-trusts it, but it is not truth-aligned, so it drags the pick toward marginal detectors even when they are wrong. The label-free weighting cannot distinguish a high-variance-but-misaligned regime from an informative one. A second candidate fix, replacing the PCA-then-MiniBatchKMeans latent and clustering with a jointly-learned deep clustering (VaDE [21], a variational autoencoder with a Gaussian-mixture prior), is more subtle and instructive. Off-the-shelf VaDE does raise regret (mean 0.056 vs 0.047 for k-means on the four ceiling datasets), but for a diagnosable reason rather than a fundamental one: with only 5-30 features the summed reconstruction term swamps the mixture clustering terms in the ELBO, so default VaDE degrades to an autoencoder with a weak mixture. Down-weighting the reconstruction so the clustering terms carry weight reverses this on the ceiling datasets (mean 0.041 vs 0.047, winning on WDBC 0.064 to 0.044 and PageBlocks 0.008 to 0.000). Across the full DAMI set, unguarded balanced VaDE is not a robust replacement: it improves 6 of 9 datasets by small margins but collapses to two or three effective clusters on others and then makes a catastrophic pick (Wilt 0.000 to 0.193, Waveform 0.016 to 0.075), so its mean regret is worse than k-means (0.055 vs 0.034). The collapse is label-free-detectable, however: VaDE resolves only two to three effective clusters (effK) precisely on the datasets it ruins (Wilt effK = 2.5, Waveform 2.8), while the datasets it helps sit at effK ≥ 3. Gating on this, using the deep clustering only when effK ≥ 3 and falling back to k-means otherwise, removes both catastrophes (Wilt 0.193 to 0.000, Waveform 0.075 to 0.016) and gives mean regret 0.030, below both k-means (0.034) and unguarded VaDE (0.055). A better-balanced deep clustering with this collapse guard is therefore a reliable lever: it helps where the ceiling bites, and its one failure mode is observable without labels. The remaining ceiling is partly closed by a global regime that avoids the over-trust failure above. Where the global-tail regime mixed marginal and centroid-distance holdouts and was high-variance, a per-feature marginal-tail regime (hold out the extreme tail of a single raw feature) is low-variance, so the discriminative weight does not over-trust it. Added to the bank it is safe in distribution, no ADBench or DAMI dataset among 32 worsens by more than 0.001, and it significantly helps out of distribution where the best detector is marginal: on 164 held-out OddBench datasets it cuts mean regret from 0.102 to 0.090 (paired p = 0.006), concentrated on the global-best losers it targets (0.228 to 0.196). It does not reach datasets whose best detector is distributional rather than marginal (DAMI Annthyroid and WDBC are unchanged), so that part of the ceiling remains open. A label-free trust signal for regimes would close the rest, and a partial one already exists: cross-regime top-1 agreement predicts realized regret on the hard (DAMI, tabular) datasets (high-agreement half 0.030 vs 0.049), giving a per-dataset confidence flag.</w:t>
       </w:r>
     </w:p>
     <w:bookmarkEnd w:id="33"/>
@@ -13897,7 +13897,7 @@
         <w:widowControl w:val="1"/>
       </w:pPr>
       <w:r>
-        <w:t xml:space="preserve">The pseudo-anomaly analogy is imperfect, and its principal limit is structural (Section 5.7): cluster-holdout regimes are local, so datasets whose best detector is global are under-served. Two candidate fixes were tested. Adding a global-tail regime fails because the label-free weighting over-trusts a high-variance misaligned regime. Replacing PCA-plus-k-means with a jointly-learned deep clustering (VaDE) is a real lever once guarded: balancing its reconstruction and clustering terms beats k-means on the ceiling datasets and on 6 of 9 DAMI datasets, and gating it on the label-free effective-cluster count, falling back to k-means when the clustering collapses, removes its catastrophic picks and yields the lowest mean regret of the three options (0.030 vs 0.034 for k-means, Section 5.7). The discriminative weight is an empirical proxy for regime trustworthiness, not a guarantee, and a global-yet-truth-aligned pseudo-anomaly regime, or a label-free trust signal for regimes, is the main open problem. The method requires an expressive fixed-length representation: on high-dimensional deep embeddings the</w:t>
+        <w:t xml:space="preserve">The pseudo-anomaly analogy is imperfect, and its principal limit is structural (Section 5.7): cluster-holdout regimes are local, so datasets whose best detector is global are under-served. Three candidate fixes were tested. A high-variance global-tail regime (mixing marginal and centroid-distance holdouts) fails because the label-free weighting over-trusts it. A low-variance per-feature marginal-tail regime does not trigger that over-trust: it is safe in distribution (no ADBench or DAMI dataset among 32 worsens by more than 0.001) and significantly reduces regret out of distribution where the best detector is marginal (164 held-out OddBench datasets, 0.102 to 0.090, p = 0.006), partially closing the ceiling. Replacing PCA-plus-k-means with a jointly-learned deep clustering (VaDE) is a real lever once guarded: balancing its reconstruction and clustering terms beats k-means on the ceiling datasets and on 6 of 9 DAMI datasets, and gating it on the label-free effective-cluster count, falling back to k-means when the clustering collapses, removes its catastrophic picks and yields the lowest mean regret of the three clustering options (0.030 vs 0.034 for k-means, Section 5.7). The discriminative weight is an empirical proxy for regime trustworthiness, not a guarantee, and reaching datasets whose best detector is distributional rather than marginal, or a label-free trust signal for regimes, is the main open problem. The method requires an expressive fixed-length representation: on high-dimensional deep embeddings the</w:t>
       </w:r>
       <w:r>
         <w:t xml:space="preserve"> </w:t>

</xml_diff>

<commit_message>
Correct VaDE/effK claims: collapse is a weighting artifact, gate not significant at scale
Two experiments walked back an overclaim honestly:
- VaDE probe (Wilt+Waveform across the reconstruction-weight axis): the effK collapse
  is a weighting artifact, not genuine low-cluster structure. At full reconstruction
  weight Waveform recovers to regret 0.000 and Wilt to 0.063; KL-warmup does not help.
- B2 scale-up (34 datasets, paired test): the effK-gated deep-clustering hybrid does
  NOT significantly beat plain k-means (0.023 vs 0.027, p=0.23). It removes the collapse
  catastrophes but is not a decisive win, so PCA+k-means stays the default.
- Rewrote the Sec 5.7 and Sec 7 wording accordingly (was "reliable lever" / "lowest
  mean regret"); the lasting value is the mechanism, not a new default.
- scripts/modal_b2_scaleup.py, modal_vade_probe.py, modal_reconcile.py (fixed missing
  volume mount that crashed the first GPU runs)

Co-Authored-By: Claude Opus 4.8 <noreply@anthropic.com>
</commit_message>
<xml_diff>
--- a/docs/adrank.docx
+++ b/docs/adrank.docx
@@ -11809,7 +11809,7 @@
           <w:b/>
           <w:bCs/>
         </w:rPr>
-        <w:t xml:space="preserve">A structural ceiling, and two candidate fixes.</w:t>
+        <w:t xml:space="preserve">A structural ceiling, and candidate fixes.</w:t>
       </w:r>
       <w:r>
         <w:t xml:space="preserve"> </w:t>
@@ -11828,7 +11828,7 @@
         <w:t xml:space="preserve">local</w:t>
       </w:r>
       <w:r>
-        <w:t xml:space="preserve">. ADRank picks a local-density detector (LOF/KNN/CBLOF) on 98% of DAMI cells, but the true best is local on only 48%; when the true best is a global detector (HBOS/COPOD/ECOD/PCA), no cluster-based regime in the bank can make it win, and the oracle-in-bank regret on those cells (0.039) is 5× that on local-best cells (0.008). The two clustering ablations that follow (global-tail regime and deep clustering) run on the nine DAMI datasets that exclude the 1555-dimensional InternetAds, on which k-means auto-calibrated regret is 0.034. The natural remedy, adding a global-tail pseudo-anomaly regime (points in the marginal tails or far from the centroid, rather than held-out clusters), does not help and slightly hurts: DAMI regret rises from 0.034 to 0.036-0.045 as such regimes are added. The mechanism is instructive: a global-tail task is high-variance (marginal detectors ace it), so the discriminative weight over-trusts it, but it is not truth-aligned, so it drags the pick toward marginal detectors even when they are wrong. The label-free weighting cannot distinguish a high-variance-but-misaligned regime from an informative one. A second candidate fix, replacing the PCA-then-MiniBatchKMeans latent and clustering with a jointly-learned deep clustering (VaDE [21], a variational autoencoder with a Gaussian-mixture prior), is more subtle and instructive. Off-the-shelf VaDE does raise regret (mean 0.056 vs 0.047 for k-means on the four ceiling datasets), but for a diagnosable reason rather than a fundamental one: with only 5-30 features the summed reconstruction term swamps the mixture clustering terms in the ELBO, so default VaDE degrades to an autoencoder with a weak mixture. Down-weighting the reconstruction so the clustering terms carry weight reverses this on the ceiling datasets (mean 0.041 vs 0.047, winning on WDBC 0.064 to 0.044 and PageBlocks 0.008 to 0.000). Across the full DAMI set, unguarded balanced VaDE is not a robust replacement: it improves 6 of 9 datasets by small margins but collapses to two or three effective clusters on others and then makes a catastrophic pick (Wilt 0.000 to 0.193, Waveform 0.016 to 0.075), so its mean regret is worse than k-means (0.055 vs 0.034). The collapse is label-free-detectable, however: VaDE resolves only two to three effective clusters (effK) precisely on the datasets it ruins (Wilt effK = 2.5, Waveform 2.8), while the datasets it helps sit at effK ≥ 3. Gating on this, using the deep clustering only when effK ≥ 3 and falling back to k-means otherwise, removes both catastrophes (Wilt 0.193 to 0.000, Waveform 0.075 to 0.016) and gives mean regret 0.030, below both k-means (0.034) and unguarded VaDE (0.055). A better-balanced deep clustering with this collapse guard is therefore a reliable lever: it helps where the ceiling bites, and its one failure mode is observable without labels. The remaining ceiling is partly closed by a global regime that avoids the over-trust failure above. Where the global-tail regime mixed marginal and centroid-distance holdouts and was high-variance, a per-feature marginal-tail regime (hold out the extreme tail of a single raw feature) is low-variance, so the discriminative weight does not over-trust it. Added to the bank it is safe in distribution, no ADBench or DAMI dataset among 32 worsens by more than 0.001, and it significantly helps out of distribution where the best detector is marginal: on 164 held-out OddBench datasets it cuts mean regret from 0.102 to 0.090 (paired p = 0.006), concentrated on the global-best losers it targets (0.228 to 0.196). It does not reach datasets whose best detector is distributional rather than marginal (DAMI Annthyroid and WDBC are unchanged), so that part of the ceiling remains open. A label-free trust signal for regimes would close the rest, and a partial one already exists: cross-regime top-1 agreement predicts realized regret on the hard (DAMI, tabular) datasets (high-agreement half 0.030 vs 0.049), giving a per-dataset confidence flag.</w:t>
+        <w:t xml:space="preserve">. ADRank picks a local-density detector (LOF/KNN/CBLOF) on 98% of DAMI cells, but the true best is local on only 48%; when the true best is a global detector (HBOS/COPOD/ECOD/PCA), no cluster-based regime in the bank can make it win, and the oracle-in-bank regret on those cells (0.039) is 5× that on local-best cells (0.008). The two clustering ablations that follow (global-tail regime and deep clustering) run on the nine DAMI datasets that exclude the 1555-dimensional InternetAds, on which k-means auto-calibrated regret is 0.034. The natural remedy, adding a global-tail pseudo-anomaly regime (points in the marginal tails or far from the centroid, rather than held-out clusters), does not help and slightly hurts: DAMI regret rises from 0.034 to 0.036-0.045 as such regimes are added. The mechanism is instructive: a global-tail task is high-variance (marginal detectors ace it), so the discriminative weight over-trusts it, but it is not truth-aligned, so it drags the pick toward marginal detectors even when they are wrong. The label-free weighting cannot distinguish a high-variance-but-misaligned regime from an informative one. A second candidate fix, replacing the PCA-then-MiniBatchKMeans latent and clustering with a jointly-learned deep clustering (VaDE [21], a variational autoencoder with a Gaussian-mixture prior), is more subtle and instructive. Off-the-shelf VaDE does raise regret (mean 0.056 vs 0.047 for k-means on the four ceiling datasets), but for a diagnosable reason rather than a fundamental one: with only 5-30 features the summed reconstruction term swamps the mixture clustering terms in the ELBO, so default VaDE degrades to an autoencoder with a weak mixture. Down-weighting the reconstruction so the clustering terms carry weight reverses this on the ceiling datasets (mean 0.041 vs 0.047, winning on WDBC 0.064 to 0.044 and PageBlocks 0.008 to 0.000). Across the full DAMI set, unguarded balanced VaDE is not a robust replacement: it improves 6 of 9 datasets by small margins but collapses to two or three effective clusters on others and then makes a catastrophic pick (Wilt 0.000 to 0.193, Waveform 0.016 to 0.075), so its mean regret is worse than k-means (0.055 vs 0.034). This collapse is a reconstruction-weighting artifact, not genuine low-cluster structure: raising the reconstruction weight back to its default lifts the effective cluster count and removes the catastrophic picks (at full weight Waveform recovers to regret 0.000 and Wilt to 0.063), but that same down-weighting is what earns VaDE its wins on the higher-dimensional WDBC and PageBlocks, so no single reconstruction weight serves every dataset. The mis-set weighting is nonetheless label-free-detectable: VaDE resolves only two to three effective clusters (effK) precisely on the datasets it over-merges (Wilt effK = 2.5, Waveform 2.8), while the datasets it helps sit at effK ≥ 3. Gating on this, using the deep clustering only when effK ≥ 3 and falling back to k-means otherwise, removes both catastrophes (Wilt 0.193 to 0.000, Waveform 0.075 to 0.016). On the nine DAMI datasets the guarded hybrid edges k-means (0.030 vs 0.034), but scaled to 34 datasets (adding ADBench tabular, where k-means already suffices) the improvement is not significant (0.023 vs 0.027, 12 wins to 5, paired p = 0.23). The guarded deep clustering is therefore safe but not decisive: it avoids the collapse catastrophes without beating the simple PCA-plus-k-means default, which we accordingly keep. The lasting value of this analysis is the mechanism, not a new default: the collapse is a reconstruction-weighting artifact and its onset is observable without labels via effK. The remaining ceiling is partly closed by a global regime that avoids the over-trust failure above. Where the global-tail regime mixed marginal and centroid-distance holdouts and was high-variance, a per-feature marginal-tail regime (hold out the extreme tail of a single raw feature) is low-variance, so the discriminative weight does not over-trust it. Added to the bank it is safe in distribution, no ADBench or DAMI dataset among 32 worsens by more than 0.001, and it significantly helps out of distribution where the best detector is marginal: on 164 held-out OddBench datasets it cuts mean regret from 0.102 to 0.090 (paired p = 0.006), concentrated on the global-best losers it targets (0.228 to 0.196). It does not reach datasets whose best detector is distributional rather than marginal (DAMI Annthyroid and WDBC are unchanged), so that part of the ceiling remains open. A label-free trust signal for regimes would close the rest, and a partial one already exists: cross-regime top-1 agreement predicts realized regret on the hard (DAMI, tabular) datasets (high-agreement half 0.030 vs 0.049), giving a per-dataset confidence flag.</w:t>
       </w:r>
     </w:p>
     <w:bookmarkEnd w:id="33"/>
@@ -13897,7 +13897,7 @@
         <w:widowControl w:val="1"/>
       </w:pPr>
       <w:r>
-        <w:t xml:space="preserve">The pseudo-anomaly analogy is imperfect, and its principal limit is structural (Section 5.7): cluster-holdout regimes are local, so datasets whose best detector is global are under-served. Three candidate fixes were tested. A high-variance global-tail regime (mixing marginal and centroid-distance holdouts) fails because the label-free weighting over-trusts it. A low-variance per-feature marginal-tail regime does not trigger that over-trust: it is safe in distribution (no ADBench or DAMI dataset among 32 worsens by more than 0.001) and significantly reduces regret out of distribution where the best detector is marginal (164 held-out OddBench datasets, 0.102 to 0.090, p = 0.006), partially closing the ceiling. Replacing PCA-plus-k-means with a jointly-learned deep clustering (VaDE) is a real lever once guarded: balancing its reconstruction and clustering terms beats k-means on the ceiling datasets and on 6 of 9 DAMI datasets, and gating it on the label-free effective-cluster count, falling back to k-means when the clustering collapses, removes its catastrophic picks and yields the lowest mean regret of the three clustering options (0.030 vs 0.034 for k-means, Section 5.7). The discriminative weight is an empirical proxy for regime trustworthiness, not a guarantee, and reaching datasets whose best detector is distributional rather than marginal, or a label-free trust signal for regimes, is the main open problem. The method requires an expressive fixed-length representation: on high-dimensional deep embeddings the</w:t>
+        <w:t xml:space="preserve">The pseudo-anomaly analogy is imperfect, and its principal limit is structural (Section 5.7): cluster-holdout regimes are local, so datasets whose best detector is global are under-served. Three candidate fixes were tested. A high-variance global-tail regime (mixing marginal and centroid-distance holdouts) fails because the label-free weighting over-trusts it. A low-variance per-feature marginal-tail regime does not trigger that over-trust: it is safe in distribution (no ADBench or DAMI dataset among 32 worsens by more than 0.001) and significantly reduces regret out of distribution where the best detector is marginal (164 held-out OddBench datasets, 0.102 to 0.090, p = 0.006), partially closing the ceiling. Replacing PCA-plus-k-means with a jointly-learned deep clustering (VaDE) is safe once guarded but not a decisive win: gating on the label-free effective-cluster count removes its catastrophic collapses, yet the guarded hybrid does not significantly beat k-means across 34 datasets (0.023 vs 0.027, paired p = 0.23), so we keep the simpler default. The collapses are a reconstruction-weighting artifact, observable without labels (Section 5.7). The discriminative weight is an empirical proxy for regime trustworthiness, not a guarantee, and reaching datasets whose best detector is distributional rather than marginal, or a label-free trust signal for regimes, is the main open problem. The method requires an expressive fixed-length representation: on high-dimensional deep embeddings the</w:t>
       </w:r>
       <w:r>
         <w:t xml:space="preserve"> </w:t>

</xml_diff>

<commit_message>
Add pooled selection-skill score (S) and cross-method skill table
Integrates a single-number, difficulty-weighted selection-quality metric:
- Define pooled selection skill S = 1 - sum(regret)/sum(random_regret) in Sec 4
  (a Murphy-style skill score; oracle=1, random=0, an R^2-analogue for selection).
- Switch Table 5b's skill column from the macro (mean-of-ratios) to pooled S, which
  is better justified and does not invert method rankings (0.79/0.93/0.93/0.91/0.43).
- Add Table 9: pooled S for every label-free strategy across all six benchmarks on a
  common per-benchmark panel. ADRank has the highest worst-case skill (0.38); IForest
  and the EM/MV internal metrics each fall below random on at least one benchmark.
- Add the OddBench S = 0.38 (95% CI [0.27, 0.47]) to Sec 5.8.
- Claim stated honestly as "highest worst-case skill", not "only robust method"
  (LOF/KNN stay positive too, at a lower floor).

Co-Authored-By: Claude Opus 4.8 <noreply@anthropic.com>
</commit_message>
<xml_diff>
--- a/docs/adrank.docx
+++ b/docs/adrank.docx
@@ -2859,7 +2859,202 @@
         </m:r>
       </m:oMath>
       <w:r>
-        <w:t xml:space="preserve">). Skill is the per-dataset form of the reduction-versus-random percentages reported throughout.</w:t>
+        <w:t xml:space="preserve">). To summarize a benchmark in one number we pool,</w:t>
+      </w:r>
+      <w:r>
+        <w:t xml:space="preserve"> </w:t>
+      </w:r>
+      <m:oMath>
+        <m:r>
+          <m:t>S</m:t>
+        </m:r>
+        <m:r>
+          <m:rPr>
+            <m:sty m:val="p"/>
+          </m:rPr>
+          <m:t>=</m:t>
+        </m:r>
+        <m:r>
+          <m:t>1</m:t>
+        </m:r>
+        <m:r>
+          <m:rPr>
+            <m:sty m:val="p"/>
+          </m:rPr>
+          <m:t>−</m:t>
+        </m:r>
+        <m:nary>
+          <m:naryPr>
+            <m:chr m:val="∑"/>
+            <m:limLoc m:val="undOvr"/>
+            <m:subHide m:val="off"/>
+            <m:supHide m:val="on"/>
+          </m:naryPr>
+          <m:sub>
+            <m:r>
+              <m:t>i</m:t>
+            </m:r>
+          </m:sub>
+          <m:sup>
+            <m:r>
+              <m:t>​</m:t>
+            </m:r>
+          </m:sup>
+          <m:e>
+            <m:sSub>
+              <m:e>
+                <m:r>
+                  <m:rPr>
+                    <m:sty m:val="p"/>
+                  </m:rPr>
+                  <m:t>r</m:t>
+                </m:r>
+                <m:r>
+                  <m:rPr>
+                    <m:sty m:val="p"/>
+                  </m:rPr>
+                  <m:t>e</m:t>
+                </m:r>
+                <m:r>
+                  <m:rPr>
+                    <m:sty m:val="p"/>
+                  </m:rPr>
+                  <m:t>g</m:t>
+                </m:r>
+                <m:r>
+                  <m:rPr>
+                    <m:sty m:val="p"/>
+                  </m:rPr>
+                  <m:t>r</m:t>
+                </m:r>
+                <m:r>
+                  <m:rPr>
+                    <m:sty m:val="p"/>
+                  </m:rPr>
+                  <m:t>e</m:t>
+                </m:r>
+                <m:r>
+                  <m:rPr>
+                    <m:sty m:val="p"/>
+                  </m:rPr>
+                  <m:t>t</m:t>
+                </m:r>
+              </m:e>
+              <m:sub>
+                <m:r>
+                  <m:t>i</m:t>
+                </m:r>
+              </m:sub>
+            </m:sSub>
+          </m:e>
+        </m:nary>
+        <m:r>
+          <m:rPr>
+            <m:sty m:val="p"/>
+          </m:rPr>
+          <m:t>/</m:t>
+        </m:r>
+        <m:nary>
+          <m:naryPr>
+            <m:chr m:val="∑"/>
+            <m:limLoc m:val="undOvr"/>
+            <m:subHide m:val="off"/>
+            <m:supHide m:val="on"/>
+          </m:naryPr>
+          <m:sub>
+            <m:r>
+              <m:t>i</m:t>
+            </m:r>
+          </m:sub>
+          <m:sup>
+            <m:r>
+              <m:t>​</m:t>
+            </m:r>
+          </m:sup>
+          <m:e>
+            <m:sSub>
+              <m:e>
+                <m:r>
+                  <m:rPr>
+                    <m:sty m:val="p"/>
+                  </m:rPr>
+                  <m:t>r</m:t>
+                </m:r>
+                <m:r>
+                  <m:rPr>
+                    <m:sty m:val="p"/>
+                  </m:rPr>
+                  <m:t>e</m:t>
+                </m:r>
+                <m:r>
+                  <m:rPr>
+                    <m:sty m:val="p"/>
+                  </m:rPr>
+                  <m:t>g</m:t>
+                </m:r>
+                <m:r>
+                  <m:rPr>
+                    <m:sty m:val="p"/>
+                  </m:rPr>
+                  <m:t>r</m:t>
+                </m:r>
+                <m:r>
+                  <m:rPr>
+                    <m:sty m:val="p"/>
+                  </m:rPr>
+                  <m:t>e</m:t>
+                </m:r>
+                <m:r>
+                  <m:rPr>
+                    <m:sty m:val="p"/>
+                  </m:rPr>
+                  <m:t>t</m:t>
+                </m:r>
+              </m:e>
+              <m:sub>
+                <m:r>
+                  <m:rPr>
+                    <m:nor/>
+                    <m:sty m:val="p"/>
+                  </m:rPr>
+                  <m:t>random</m:t>
+                </m:r>
+                <m:r>
+                  <m:rPr>
+                    <m:sty m:val="p"/>
+                  </m:rPr>
+                  <m:t>,</m:t>
+                </m:r>
+                <m:r>
+                  <m:t>i</m:t>
+                </m:r>
+              </m:sub>
+            </m:sSub>
+          </m:e>
+        </m:nary>
+      </m:oMath>
+      <w:r>
+        <w:t xml:space="preserve">: a Murphy-style skill score whose reference policy is the uniform-random pick and whose perfect score is the oracle, an</w:t>
+      </w:r>
+      <w:r>
+        <w:t xml:space="preserve"> </w:t>
+      </w:r>
+      <m:oMath>
+        <m:sSup>
+          <m:e>
+            <m:r>
+              <m:t>R</m:t>
+            </m:r>
+          </m:e>
+          <m:sup>
+            <m:r>
+              <m:t>2</m:t>
+            </m:r>
+          </m:sup>
+        </m:sSup>
+      </m:oMath>
+      <w:r>
+        <w:t xml:space="preserve">-analogue for selection. Pooling weights each dataset by how much the choice mattered, so trivially-tied datasets contribute negligibly to both sums rather than destabilizing a mean of ratios.</w:t>
       </w:r>
     </w:p>
     <w:p>
@@ -9663,7 +9858,21 @@
         <w:t xml:space="preserve"> </w:t>
       </w:r>
       <w:r>
-        <w:t xml:space="preserve">Table 5b sets ADRank against the canonical Excess-Mass and Mass-Volume internal metrics [1], on the same datasets and true rankings. ADRank has lower mean regret than both EM and MV on every modality, but a paired analysis (per-dataset regret over seeds, Wilcoxon signed-rank) sharpens the picture. ADRank beats random with high significance everywhere (tabular p = 1e-5, image p = 4e-6, text p = 5e-4; 23/26, 19/20, 12/13 datasets won). Against EM it is significantly better only where EM's high-dimensional volume estimate breaks: on 512-dimensional image embeddings ADRank wins 20 of 20 datasets (p = 2e-6), whereas on tabular (p = 0.80, 11/26 wins) and text (p = 0.69) the two are statistically comparable. The robust claim is therefore not that ADRank uniformly dominates EM/MV, but that it matches them where they work and stays well above random where they collapse below it: EM and MV fall to or under random on image embeddings and DAMI (EM 0.078 vs random 0.074 on images; 0.074 vs 0.067 on DAMI), while ADRank never does. The skill column, the per-dataset mean fraction of the achievable-over-random improvement that ADRank captures, ranges from 0.88 on images to 0.24 on the hard DAMI benchmark.</w:t>
+        <w:t xml:space="preserve">Table 5b sets ADRank against the canonical Excess-Mass and Mass-Volume internal metrics [1], on the same datasets and true rankings. ADRank has lower mean regret than both EM and MV on every modality, but a paired analysis (per-dataset regret over seeds, Wilcoxon signed-rank) sharpens the picture. ADRank beats random with high significance everywhere (tabular p = 1e-5, image p = 4e-6, text p = 5e-4; 23/26, 19/20, 12/13 datasets won). Against EM it is significantly better only where EM's high-dimensional volume estimate breaks: on 512-dimensional image embeddings ADRank wins 20 of 20 datasets (p = 2e-6), whereas on tabular (p = 0.80, 11/26 wins) and text (p = 0.69) the two are statistically comparable. The robust claim is therefore not that ADRank uniformly dominates EM/MV, but that it matches them where they work and stays well above random where they collapse below it: EM and MV fall to or under random on image embeddings and DAMI (EM 0.078 vs random 0.074 on images; 0.074 vs 0.067 on DAMI), while ADRank never does. The pooled skill</w:t>
+      </w:r>
+      <w:r>
+        <w:t xml:space="preserve"> </w:t>
+      </w:r>
+      <m:oMath>
+        <m:r>
+          <m:t>S</m:t>
+        </m:r>
+      </m:oMath>
+      <w:r>
+        <w:t xml:space="preserve"> </w:t>
+      </w:r>
+      <w:r>
+        <w:t xml:space="preserve">(Section 4) ranges from 0.93 on images to 0.43 on the hard DAMI benchmark, the fraction of the achievable over-random improvement ADRank captures on each.</w:t>
       </w:r>
     </w:p>
     <w:tbl>
@@ -9911,6 +10120,24 @@
               </w:rPr>
               <w:t xml:space="preserve">ADRank skill</w:t>
             </w:r>
+            <w:r>
+              <w:rPr>
+                <w:rFonts w:ascii="Times New Roman" w:hAnsi="Times New Roman"/>
+                <w:b/>
+                <w:sz w:val="18"/>
+              </w:rPr>
+              <w:t xml:space="preserve"> </w:t>
+            </w:r>
+            <w:r>
+              <w:rPr>
+                <w:rFonts w:ascii="Times New Roman" w:hAnsi="Times New Roman"/>
+                <w:b/>
+                <w:i/>
+                <w:iCs/>
+                <w:sz w:val="18"/>
+              </w:rPr>
+              <w:t xml:space="preserve">S</w:t>
+            </w:r>
           </w:p>
         </w:tc>
       </w:tr>
@@ -10116,7 +10343,7 @@
                 <w:rFonts w:ascii="Times New Roman" w:hAnsi="Times New Roman"/>
                 <w:sz w:val="18"/>
               </w:rPr>
-              <w:t xml:space="preserve">0.61</w:t>
+              <w:t xml:space="preserve">0.79</w:t>
             </w:r>
           </w:p>
         </w:tc>
@@ -10323,7 +10550,7 @@
                 <w:rFonts w:ascii="Times New Roman" w:hAnsi="Times New Roman"/>
                 <w:sz w:val="18"/>
               </w:rPr>
-              <w:t xml:space="preserve">0.88</w:t>
+              <w:t xml:space="preserve">0.93</w:t>
             </w:r>
           </w:p>
         </w:tc>
@@ -10530,7 +10757,7 @@
                 <w:rFonts w:ascii="Times New Roman" w:hAnsi="Times New Roman"/>
                 <w:sz w:val="18"/>
               </w:rPr>
-              <w:t xml:space="preserve">0.85</w:t>
+              <w:t xml:space="preserve">0.93</w:t>
             </w:r>
           </w:p>
         </w:tc>
@@ -10737,7 +10964,7 @@
                 <w:rFonts w:ascii="Times New Roman" w:hAnsi="Times New Roman"/>
                 <w:sz w:val="18"/>
               </w:rPr>
-              <w:t xml:space="preserve">0.76</w:t>
+              <w:t xml:space="preserve">0.91</w:t>
             </w:r>
           </w:p>
         </w:tc>
@@ -10944,7 +11171,7 @@
                 <w:rFonts w:ascii="Times New Roman" w:hAnsi="Times New Roman"/>
                 <w:sz w:val="18"/>
               </w:rPr>
-              <w:t xml:space="preserve">0.24</w:t>
+              <w:t xml:space="preserve">0.43</w:t>
             </w:r>
           </w:p>
         </w:tc>
@@ -10970,12 +11197,21 @@
         <w:t xml:space="preserve"> </w:t>
       </w:r>
       <w:r>
-        <w:t xml:space="preserve">regret@1 (absolute AUC points; lower is better) for ADRank versus label-free baselines. EM/MV are the Goix internal metrics, estimated by scoring both the data and a uniform Monte-Carlo sample of the feature box with each fitted detector. Consensus (rank by agreement with the mean detector score) scores Spearman ρ = -0.15 on tabular and is worse than random; its regret is dominated by that failure and omitted here for brevity. "skill" is the per-dataset mean of</w:t>
+        <w:t xml:space="preserve">regret@1 (absolute AUC points; lower is better) for ADRank versus label-free baselines. EM/MV are the Goix internal metrics, estimated by scoring both the data and a uniform Monte-Carlo sample of the feature box with each fitted detector. Consensus (rank by agreement with the mean detector score) scores Spearman ρ = -0.15 on tabular and is worse than random; its regret is dominated by that failure and omitted here for brevity. "skill" is the pooled selection skill</w:t>
       </w:r>
       <w:r>
         <w:t xml:space="preserve"> </w:t>
       </w:r>
       <m:oMath>
+        <m:r>
+          <m:t>S</m:t>
+        </m:r>
+        <m:r>
+          <m:rPr>
+            <m:sty m:val="p"/>
+          </m:rPr>
+          <m:t>=</m:t>
+        </m:r>
         <m:r>
           <m:t>1</m:t>
         </m:r>
@@ -10984,6 +11220,12 @@
             <m:sty m:val="p"/>
           </m:rPr>
           <m:t>−</m:t>
+        </m:r>
+        <m:r>
+          <m:rPr>
+            <m:sty m:val="p"/>
+          </m:rPr>
+          <m:t>∑</m:t>
         </m:r>
         <m:r>
           <m:rPr>
@@ -11026,6 +11268,12 @@
             <m:sty m:val="p"/>
           </m:rPr>
           <m:t>/</m:t>
+        </m:r>
+        <m:r>
+          <m:rPr>
+            <m:sty m:val="p"/>
+          </m:rPr>
+          <m:t>∑</m:t>
         </m:r>
         <m:sSub>
           <m:e>
@@ -11081,7 +11329,7 @@
         <w:t xml:space="preserve"> </w:t>
       </w:r>
       <w:r>
-        <w:t xml:space="preserve">(Section 4), the fraction of achievable improvement ADRank captures; it is a mean of per-dataset ratios and so differs from one minus the ratio of the column means. ADRank is lowest on every row, and unlike EM/MV never falls to the random baseline.</w:t>
+        <w:t xml:space="preserve">over the modality's datasets (Section 4), the fraction of the achievable over-random improvement ADRank captures; pooling weights each dataset by how much the choice mattered, so it differs slightly from one minus the ratio of the rounded column means. ADRank is lowest on every row, and unlike EM/MV never falls to the random baseline.</w:t>
       </w:r>
     </w:p>
     <w:bookmarkEnd w:id="32"/>
@@ -13630,6 +13878,1810 @@
       </w:r>
       <w:r>
         <w:t xml:space="preserve">between benchmarks, LOF is strongest in-distribution, Isolation Forest on OddBench, so committing to any one detector in advance is unsafe, and ADRank attains the best-fixed level on each benchmark without knowing which detector that is. On OddBench it ties that benchmark's best fixed detector (IForest, p = 0.51) rather than beating it, which is the honest ceiling of a selector when one detector happens to dominate a corpus. The 53 datasets where ADRank trails random share the structural cause of Section 5.7: each has a global or marginal detector at near-perfect AUC (HBOS or PCA at 1.000 on DoctorVisits, CampaignOutcome, and similar single-feature-threshold labels) that cluster-holdout's local pseudo-anomalies cannot construct. The failure is the local-versus-global ceiling, now confirmed out of distribution, not a breakdown of the ranking signal.</w:t>
+      </w:r>
+    </w:p>
+    <w:p>
+      <w:pPr>
+        <w:pStyle w:val="BodyText"/>
+        <w:jc w:val="both"/>
+        <w:keepNext w:val="0"/>
+        <w:keepLines w:val="0"/>
+        <w:widowControl w:val="1"/>
+      </w:pPr>
+      <w:r>
+        <w:rPr>
+          <w:b/>
+          <w:bCs/>
+        </w:rPr>
+        <w:t xml:space="preserve">One number for the whole comparison: selection skill.</w:t>
+      </w:r>
+      <w:r>
+        <w:t xml:space="preserve"> </w:t>
+      </w:r>
+      <w:r>
+        <w:t xml:space="preserve">The skill score</w:t>
+      </w:r>
+      <w:r>
+        <w:t xml:space="preserve"> </w:t>
+      </w:r>
+      <m:oMath>
+        <m:r>
+          <m:t>S</m:t>
+        </m:r>
+      </m:oMath>
+      <w:r>
+        <w:t xml:space="preserve"> </w:t>
+      </w:r>
+      <w:r>
+        <w:t xml:space="preserve">(Section 4) collapses each benchmark to the fraction of the achievable random-to-oracle improvement a method captures. Table 9 reports it for every label-free strategy across all six benchmarks, each on a common dataset panel so the methods are scored on identical data. On frozen OddBench ADRank scores</w:t>
+      </w:r>
+      <w:r>
+        <w:t xml:space="preserve"> </w:t>
+      </w:r>
+      <m:oMath>
+        <m:r>
+          <m:t>S</m:t>
+        </m:r>
+        <m:r>
+          <m:rPr>
+            <m:sty m:val="p"/>
+          </m:rPr>
+          <m:t>=</m:t>
+        </m:r>
+        <m:r>
+          <m:t>0.38</m:t>
+        </m:r>
+      </m:oMath>
+      <w:r>
+        <w:t xml:space="preserve"> </w:t>
+      </w:r>
+      <w:r>
+        <w:t xml:space="preserve">(95% dataset-bootstrap CI [0.27, 0.47]). The pattern is the point: ADRank has the highest worst-case skill of any method (0.38, its minimum across the six), while the popular Isolation Forest default and both internal metrics (EM, MV) each fall below random (</w:t>
+      </w:r>
+      <m:oMath>
+        <m:r>
+          <m:t>S</m:t>
+        </m:r>
+        <m:r>
+          <m:rPr>
+            <m:sty m:val="p"/>
+          </m:rPr>
+          <m:t>&lt;</m:t>
+        </m:r>
+        <m:r>
+          <m:t>0</m:t>
+        </m:r>
+      </m:oMath>
+      <w:r>
+        <w:t xml:space="preserve">) on at least one benchmark. The local-density detectors LOF and KNN stay positive everywhere too, but at a lower floor (0.21 and 0.23), and on the embedding modalities only because ADRank itself selects LOF there; no fixed detector combines an above-random skill on every benchmark with the top skill on the two where selection is hardest, tabular and OddBench, which ADRank alone does.</w:t>
+      </w:r>
+    </w:p>
+    <w:tbl>
+      <w:tblPr>
+        <w:tblStyle w:val="Table"/>
+        <w:tblW w:type="pct" w:w="5000"/>
+        <w:jc w:val="center"/>
+        <w:tblLook w:firstRow="1" w:lastRow="0" w:firstColumn="0" w:lastColumn="0" w:noHBand="0" w:noVBand="0" w:val="0020"/>
+        <w:tblLayout w:type="autofit"/>
+        <w:tblBorders>
+          <w:top w:val="single" w:sz="10" w:color="4F6272"/>
+          <w:bottom w:val="single" w:sz="10" w:color="4F6272"/>
+          <w:insideH w:val="single" w:sz="5" w:color="9FB0C2"/>
+          <w:left w:val="single" w:sz="6" w:color="9FB0C2"/>
+          <w:right w:val="single" w:sz="6" w:color="9FB0C2"/>
+          <w:insideV w:val="single" w:sz="5" w:color="D9E1E8"/>
+        </w:tblBorders>
+      </w:tblPr>
+      <w:tblGrid>
+        <w:gridCol w:w="990"/>
+        <w:gridCol w:w="990"/>
+        <w:gridCol w:w="990"/>
+        <w:gridCol w:w="990"/>
+        <w:gridCol w:w="990"/>
+        <w:gridCol w:w="990"/>
+        <w:gridCol w:w="990"/>
+        <w:gridCol w:w="990"/>
+      </w:tblGrid>
+      <w:tr>
+        <w:trPr>
+          <w:tblHeader w:val="on"/>
+        </w:trPr>
+        <w:tc>
+          <w:tcPr>
+            <w:shd w:fill="EEF3F7"/>
+            <w:tcBorders>
+              <w:left w:val="nil"/>
+              <w:right w:val="nil"/>
+              <w:top w:val="nil"/>
+              <w:bottom w:val="single" w:sz="8" w:color="9FB0C2"/>
+            </w:tcBorders>
+            <w:vAlign w:val="center"/>
+          </w:tcPr>
+          <w:p>
+            <w:pPr>
+              <w:pStyle w:val="Compact"/>
+              <w:spacing w:before="0" w:after="20" w:line="240" w:lineRule="auto"/>
+              <w:jc w:val="center"/>
+              <w:suppressAutoHyphens/>
+              <w:keepNext w:val="0"/>
+              <w:keepLines/>
+              <w:widowControl w:val="1"/>
+            </w:pPr>
+            <w:r>
+              <w:rPr>
+                <w:rFonts w:ascii="Times New Roman" w:hAnsi="Times New Roman"/>
+                <w:b/>
+                <w:sz w:val="18"/>
+              </w:rPr>
+              <w:t xml:space="preserve">Method</w:t>
+            </w:r>
+          </w:p>
+        </w:tc>
+        <w:tc>
+          <w:tcPr>
+            <w:shd w:fill="EEF3F7"/>
+            <w:tcBorders>
+              <w:left w:val="nil"/>
+              <w:right w:val="nil"/>
+              <w:top w:val="nil"/>
+              <w:bottom w:val="single" w:sz="8" w:color="9FB0C2"/>
+            </w:tcBorders>
+            <w:vAlign w:val="center"/>
+          </w:tcPr>
+          <w:p>
+            <w:pPr>
+              <w:pStyle w:val="Compact"/>
+              <w:spacing w:before="0" w:after="20" w:line="240" w:lineRule="auto"/>
+              <w:jc w:val="center"/>
+              <w:suppressAutoHyphens/>
+              <w:keepNext w:val="0"/>
+              <w:keepLines/>
+              <w:widowControl w:val="1"/>
+            </w:pPr>
+            <w:r>
+              <w:rPr>
+                <w:rFonts w:ascii="Times New Roman" w:hAnsi="Times New Roman"/>
+                <w:b/>
+                <w:sz w:val="18"/>
+              </w:rPr>
+              <w:t xml:space="preserve">OddBench</w:t>
+            </w:r>
+          </w:p>
+        </w:tc>
+        <w:tc>
+          <w:tcPr>
+            <w:shd w:fill="EEF3F7"/>
+            <w:tcBorders>
+              <w:left w:val="nil"/>
+              <w:right w:val="nil"/>
+              <w:top w:val="nil"/>
+              <w:bottom w:val="single" w:sz="8" w:color="9FB0C2"/>
+            </w:tcBorders>
+            <w:vAlign w:val="center"/>
+          </w:tcPr>
+          <w:p>
+            <w:pPr>
+              <w:pStyle w:val="Compact"/>
+              <w:spacing w:before="0" w:after="20" w:line="240" w:lineRule="auto"/>
+              <w:jc w:val="center"/>
+              <w:suppressAutoHyphens/>
+              <w:keepNext w:val="0"/>
+              <w:keepLines/>
+              <w:widowControl w:val="1"/>
+            </w:pPr>
+            <w:r>
+              <w:rPr>
+                <w:rFonts w:ascii="Times New Roman" w:hAnsi="Times New Roman"/>
+                <w:b/>
+                <w:sz w:val="18"/>
+              </w:rPr>
+              <w:t xml:space="preserve">Tabular</w:t>
+            </w:r>
+          </w:p>
+        </w:tc>
+        <w:tc>
+          <w:tcPr>
+            <w:shd w:fill="EEF3F7"/>
+            <w:tcBorders>
+              <w:left w:val="nil"/>
+              <w:right w:val="nil"/>
+              <w:top w:val="nil"/>
+              <w:bottom w:val="single" w:sz="8" w:color="9FB0C2"/>
+            </w:tcBorders>
+            <w:vAlign w:val="center"/>
+          </w:tcPr>
+          <w:p>
+            <w:pPr>
+              <w:pStyle w:val="Compact"/>
+              <w:spacing w:before="0" w:after="20" w:line="240" w:lineRule="auto"/>
+              <w:jc w:val="center"/>
+              <w:suppressAutoHyphens/>
+              <w:keepNext w:val="0"/>
+              <w:keepLines/>
+              <w:widowControl w:val="1"/>
+            </w:pPr>
+            <w:r>
+              <w:rPr>
+                <w:rFonts w:ascii="Times New Roman" w:hAnsi="Times New Roman"/>
+                <w:b/>
+                <w:sz w:val="18"/>
+              </w:rPr>
+              <w:t xml:space="preserve">Image</w:t>
+            </w:r>
+          </w:p>
+        </w:tc>
+        <w:tc>
+          <w:tcPr>
+            <w:shd w:fill="EEF3F7"/>
+            <w:tcBorders>
+              <w:left w:val="nil"/>
+              <w:right w:val="nil"/>
+              <w:top w:val="nil"/>
+              <w:bottom w:val="single" w:sz="8" w:color="9FB0C2"/>
+            </w:tcBorders>
+            <w:vAlign w:val="center"/>
+          </w:tcPr>
+          <w:p>
+            <w:pPr>
+              <w:pStyle w:val="Compact"/>
+              <w:spacing w:before="0" w:after="20" w:line="240" w:lineRule="auto"/>
+              <w:jc w:val="center"/>
+              <w:suppressAutoHyphens/>
+              <w:keepNext w:val="0"/>
+              <w:keepLines/>
+              <w:widowControl w:val="1"/>
+            </w:pPr>
+            <w:r>
+              <w:rPr>
+                <w:rFonts w:ascii="Times New Roman" w:hAnsi="Times New Roman"/>
+                <w:b/>
+                <w:sz w:val="18"/>
+              </w:rPr>
+              <w:t xml:space="preserve">Text</w:t>
+            </w:r>
+          </w:p>
+        </w:tc>
+        <w:tc>
+          <w:tcPr>
+            <w:shd w:fill="EEF3F7"/>
+            <w:tcBorders>
+              <w:left w:val="nil"/>
+              <w:right w:val="nil"/>
+              <w:top w:val="nil"/>
+              <w:bottom w:val="single" w:sz="8" w:color="9FB0C2"/>
+            </w:tcBorders>
+            <w:vAlign w:val="center"/>
+          </w:tcPr>
+          <w:p>
+            <w:pPr>
+              <w:pStyle w:val="Compact"/>
+              <w:spacing w:before="0" w:after="20" w:line="240" w:lineRule="auto"/>
+              <w:jc w:val="center"/>
+              <w:suppressAutoHyphens/>
+              <w:keepNext w:val="0"/>
+              <w:keepLines/>
+              <w:widowControl w:val="1"/>
+            </w:pPr>
+            <w:r>
+              <w:rPr>
+                <w:rFonts w:ascii="Times New Roman" w:hAnsi="Times New Roman"/>
+                <w:b/>
+                <w:sz w:val="18"/>
+              </w:rPr>
+              <w:t xml:space="preserve">Time-series</w:t>
+            </w:r>
+          </w:p>
+        </w:tc>
+        <w:tc>
+          <w:tcPr>
+            <w:shd w:fill="EEF3F7"/>
+            <w:tcBorders>
+              <w:left w:val="nil"/>
+              <w:right w:val="nil"/>
+              <w:top w:val="nil"/>
+              <w:bottom w:val="single" w:sz="8" w:color="9FB0C2"/>
+            </w:tcBorders>
+            <w:vAlign w:val="center"/>
+          </w:tcPr>
+          <w:p>
+            <w:pPr>
+              <w:pStyle w:val="Compact"/>
+              <w:spacing w:before="0" w:after="20" w:line="240" w:lineRule="auto"/>
+              <w:jc w:val="center"/>
+              <w:suppressAutoHyphens/>
+              <w:keepNext w:val="0"/>
+              <w:keepLines/>
+              <w:widowControl w:val="1"/>
+            </w:pPr>
+            <w:r>
+              <w:rPr>
+                <w:rFonts w:ascii="Times New Roman" w:hAnsi="Times New Roman"/>
+                <w:b/>
+                <w:sz w:val="18"/>
+              </w:rPr>
+              <w:t xml:space="preserve">DAMI</w:t>
+            </w:r>
+          </w:p>
+        </w:tc>
+        <w:tc>
+          <w:tcPr>
+            <w:shd w:fill="EEF3F7"/>
+            <w:tcBorders>
+              <w:left w:val="nil"/>
+              <w:right w:val="nil"/>
+              <w:top w:val="nil"/>
+              <w:bottom w:val="single" w:sz="8" w:color="9FB0C2"/>
+            </w:tcBorders>
+            <w:vAlign w:val="center"/>
+          </w:tcPr>
+          <w:p>
+            <w:pPr>
+              <w:pStyle w:val="Compact"/>
+              <w:spacing w:before="0" w:after="20" w:line="240" w:lineRule="auto"/>
+              <w:jc w:val="center"/>
+              <w:suppressAutoHyphens/>
+              <w:keepNext w:val="0"/>
+              <w:keepLines/>
+              <w:widowControl w:val="1"/>
+            </w:pPr>
+            <w:r>
+              <w:rPr>
+                <w:rFonts w:ascii="Times New Roman" w:hAnsi="Times New Roman"/>
+                <w:b/>
+                <w:sz w:val="18"/>
+              </w:rPr>
+              <w:t xml:space="preserve">worst</w:t>
+            </w:r>
+          </w:p>
+        </w:tc>
+      </w:tr>
+      <w:tr>
+        <w:tc>
+          <w:tcPr>
+            <w:tcBorders>
+              <w:left w:val="nil"/>
+              <w:right w:val="nil"/>
+              <w:top w:val="nil"/>
+              <w:bottom w:val="single" w:sz="4" w:color="D9E1E8"/>
+            </w:tcBorders>
+            <w:vAlign w:val="center"/>
+          </w:tcPr>
+          <w:p>
+            <w:pPr>
+              <w:pStyle w:val="Compact"/>
+              <w:spacing w:before="0" w:after="20" w:line="240" w:lineRule="auto"/>
+              <w:jc w:val="center"/>
+              <w:suppressAutoHyphens/>
+              <w:keepNext w:val="0"/>
+              <w:keepLines/>
+              <w:widowControl w:val="1"/>
+            </w:pPr>
+            <w:r>
+              <w:rPr>
+                <w:rFonts w:ascii="Times New Roman" w:hAnsi="Times New Roman"/>
+                <w:b/>
+                <w:bCs/>
+                <w:sz w:val="18"/>
+              </w:rPr>
+              <w:t xml:space="preserve">ADRank</w:t>
+            </w:r>
+          </w:p>
+        </w:tc>
+        <w:tc>
+          <w:tcPr>
+            <w:tcBorders>
+              <w:left w:val="nil"/>
+              <w:right w:val="nil"/>
+              <w:top w:val="nil"/>
+              <w:bottom w:val="single" w:sz="4" w:color="D9E1E8"/>
+            </w:tcBorders>
+            <w:vAlign w:val="center"/>
+          </w:tcPr>
+          <w:p>
+            <w:pPr>
+              <w:pStyle w:val="Compact"/>
+              <w:spacing w:before="0" w:after="20" w:line="240" w:lineRule="auto"/>
+              <w:jc w:val="center"/>
+              <w:suppressAutoHyphens/>
+              <w:keepNext w:val="0"/>
+              <w:keepLines/>
+              <w:widowControl w:val="1"/>
+            </w:pPr>
+            <w:r>
+              <w:rPr>
+                <w:rFonts w:ascii="Times New Roman" w:hAnsi="Times New Roman"/>
+                <w:b/>
+                <w:bCs/>
+                <w:sz w:val="18"/>
+              </w:rPr>
+              <w:t xml:space="preserve">0.38</w:t>
+            </w:r>
+          </w:p>
+        </w:tc>
+        <w:tc>
+          <w:tcPr>
+            <w:tcBorders>
+              <w:left w:val="nil"/>
+              <w:right w:val="nil"/>
+              <w:top w:val="nil"/>
+              <w:bottom w:val="single" w:sz="4" w:color="D9E1E8"/>
+            </w:tcBorders>
+            <w:vAlign w:val="center"/>
+          </w:tcPr>
+          <w:p>
+            <w:pPr>
+              <w:pStyle w:val="Compact"/>
+              <w:spacing w:before="0" w:after="20" w:line="240" w:lineRule="auto"/>
+              <w:jc w:val="center"/>
+              <w:suppressAutoHyphens/>
+              <w:keepNext w:val="0"/>
+              <w:keepLines/>
+              <w:widowControl w:val="1"/>
+            </w:pPr>
+            <w:r>
+              <w:rPr>
+                <w:rFonts w:ascii="Times New Roman" w:hAnsi="Times New Roman"/>
+                <w:b/>
+                <w:bCs/>
+                <w:sz w:val="18"/>
+              </w:rPr>
+              <w:t xml:space="preserve">0.79</w:t>
+            </w:r>
+          </w:p>
+        </w:tc>
+        <w:tc>
+          <w:tcPr>
+            <w:tcBorders>
+              <w:left w:val="nil"/>
+              <w:right w:val="nil"/>
+              <w:top w:val="nil"/>
+              <w:bottom w:val="single" w:sz="4" w:color="D9E1E8"/>
+            </w:tcBorders>
+            <w:vAlign w:val="center"/>
+          </w:tcPr>
+          <w:p>
+            <w:pPr>
+              <w:pStyle w:val="Compact"/>
+              <w:spacing w:before="0" w:after="20" w:line="240" w:lineRule="auto"/>
+              <w:jc w:val="center"/>
+              <w:suppressAutoHyphens/>
+              <w:keepNext w:val="0"/>
+              <w:keepLines/>
+              <w:widowControl w:val="1"/>
+            </w:pPr>
+            <w:r>
+              <w:rPr>
+                <w:rFonts w:ascii="Times New Roman" w:hAnsi="Times New Roman"/>
+                <w:sz w:val="18"/>
+              </w:rPr>
+              <w:t xml:space="preserve">0.93</w:t>
+            </w:r>
+          </w:p>
+        </w:tc>
+        <w:tc>
+          <w:tcPr>
+            <w:tcBorders>
+              <w:left w:val="nil"/>
+              <w:right w:val="nil"/>
+              <w:top w:val="nil"/>
+              <w:bottom w:val="single" w:sz="4" w:color="D9E1E8"/>
+            </w:tcBorders>
+            <w:vAlign w:val="center"/>
+          </w:tcPr>
+          <w:p>
+            <w:pPr>
+              <w:pStyle w:val="Compact"/>
+              <w:spacing w:before="0" w:after="20" w:line="240" w:lineRule="auto"/>
+              <w:jc w:val="center"/>
+              <w:suppressAutoHyphens/>
+              <w:keepNext w:val="0"/>
+              <w:keepLines/>
+              <w:widowControl w:val="1"/>
+            </w:pPr>
+            <w:r>
+              <w:rPr>
+                <w:rFonts w:ascii="Times New Roman" w:hAnsi="Times New Roman"/>
+                <w:sz w:val="18"/>
+              </w:rPr>
+              <w:t xml:space="preserve">0.93</w:t>
+            </w:r>
+          </w:p>
+        </w:tc>
+        <w:tc>
+          <w:tcPr>
+            <w:tcBorders>
+              <w:left w:val="nil"/>
+              <w:right w:val="nil"/>
+              <w:top w:val="nil"/>
+              <w:bottom w:val="single" w:sz="4" w:color="D9E1E8"/>
+            </w:tcBorders>
+            <w:vAlign w:val="center"/>
+          </w:tcPr>
+          <w:p>
+            <w:pPr>
+              <w:pStyle w:val="Compact"/>
+              <w:spacing w:before="0" w:after="20" w:line="240" w:lineRule="auto"/>
+              <w:jc w:val="center"/>
+              <w:suppressAutoHyphens/>
+              <w:keepNext w:val="0"/>
+              <w:keepLines/>
+              <w:widowControl w:val="1"/>
+            </w:pPr>
+            <w:r>
+              <w:rPr>
+                <w:rFonts w:ascii="Times New Roman" w:hAnsi="Times New Roman"/>
+                <w:sz w:val="18"/>
+              </w:rPr>
+              <w:t xml:space="preserve">0.91</w:t>
+            </w:r>
+          </w:p>
+        </w:tc>
+        <w:tc>
+          <w:tcPr>
+            <w:tcBorders>
+              <w:left w:val="nil"/>
+              <w:right w:val="nil"/>
+              <w:top w:val="nil"/>
+              <w:bottom w:val="single" w:sz="4" w:color="D9E1E8"/>
+            </w:tcBorders>
+            <w:vAlign w:val="center"/>
+          </w:tcPr>
+          <w:p>
+            <w:pPr>
+              <w:pStyle w:val="Compact"/>
+              <w:spacing w:before="0" w:after="20" w:line="240" w:lineRule="auto"/>
+              <w:jc w:val="center"/>
+              <w:suppressAutoHyphens/>
+              <w:keepNext w:val="0"/>
+              <w:keepLines/>
+              <w:widowControl w:val="1"/>
+            </w:pPr>
+            <w:r>
+              <w:rPr>
+                <w:rFonts w:ascii="Times New Roman" w:hAnsi="Times New Roman"/>
+                <w:sz w:val="18"/>
+              </w:rPr>
+              <w:t xml:space="preserve">0.43</w:t>
+            </w:r>
+          </w:p>
+        </w:tc>
+        <w:tc>
+          <w:tcPr>
+            <w:tcBorders>
+              <w:left w:val="nil"/>
+              <w:right w:val="nil"/>
+              <w:top w:val="nil"/>
+              <w:bottom w:val="single" w:sz="4" w:color="D9E1E8"/>
+            </w:tcBorders>
+            <w:vAlign w:val="center"/>
+          </w:tcPr>
+          <w:p>
+            <w:pPr>
+              <w:pStyle w:val="Compact"/>
+              <w:spacing w:before="0" w:after="20" w:line="240" w:lineRule="auto"/>
+              <w:jc w:val="center"/>
+              <w:suppressAutoHyphens/>
+              <w:keepNext w:val="0"/>
+              <w:keepLines/>
+              <w:widowControl w:val="1"/>
+            </w:pPr>
+            <w:r>
+              <w:rPr>
+                <w:rFonts w:ascii="Times New Roman" w:hAnsi="Times New Roman"/>
+                <w:b/>
+                <w:bCs/>
+                <w:sz w:val="18"/>
+              </w:rPr>
+              <w:t xml:space="preserve">0.38</w:t>
+            </w:r>
+          </w:p>
+        </w:tc>
+      </w:tr>
+      <w:tr>
+        <w:tc>
+          <w:tcPr>
+            <w:tcBorders>
+              <w:left w:val="nil"/>
+              <w:right w:val="nil"/>
+              <w:top w:val="nil"/>
+              <w:bottom w:val="single" w:sz="4" w:color="D9E1E8"/>
+            </w:tcBorders>
+            <w:vAlign w:val="center"/>
+          </w:tcPr>
+          <w:p>
+            <w:pPr>
+              <w:pStyle w:val="Compact"/>
+              <w:spacing w:before="0" w:after="20" w:line="240" w:lineRule="auto"/>
+              <w:jc w:val="center"/>
+              <w:suppressAutoHyphens/>
+              <w:keepNext w:val="0"/>
+              <w:keepLines/>
+              <w:widowControl w:val="1"/>
+            </w:pPr>
+            <w:r>
+              <w:rPr>
+                <w:rFonts w:ascii="Times New Roman" w:hAnsi="Times New Roman"/>
+                <w:sz w:val="18"/>
+              </w:rPr>
+              <w:t xml:space="preserve">always-IForest</w:t>
+            </w:r>
+          </w:p>
+        </w:tc>
+        <w:tc>
+          <w:tcPr>
+            <w:tcBorders>
+              <w:left w:val="nil"/>
+              <w:right w:val="nil"/>
+              <w:top w:val="nil"/>
+              <w:bottom w:val="single" w:sz="4" w:color="D9E1E8"/>
+            </w:tcBorders>
+            <w:vAlign w:val="center"/>
+          </w:tcPr>
+          <w:p>
+            <w:pPr>
+              <w:pStyle w:val="Compact"/>
+              <w:spacing w:before="0" w:after="20" w:line="240" w:lineRule="auto"/>
+              <w:jc w:val="center"/>
+              <w:suppressAutoHyphens/>
+              <w:keepNext w:val="0"/>
+              <w:keepLines/>
+              <w:widowControl w:val="1"/>
+            </w:pPr>
+            <w:r>
+              <w:rPr>
+                <w:rFonts w:ascii="Times New Roman" w:hAnsi="Times New Roman"/>
+                <w:sz w:val="18"/>
+              </w:rPr>
+              <w:t xml:space="preserve">0.30</w:t>
+            </w:r>
+          </w:p>
+        </w:tc>
+        <w:tc>
+          <w:tcPr>
+            <w:tcBorders>
+              <w:left w:val="nil"/>
+              <w:right w:val="nil"/>
+              <w:top w:val="nil"/>
+              <w:bottom w:val="single" w:sz="4" w:color="D9E1E8"/>
+            </w:tcBorders>
+            <w:vAlign w:val="center"/>
+          </w:tcPr>
+          <w:p>
+            <w:pPr>
+              <w:pStyle w:val="Compact"/>
+              <w:spacing w:before="0" w:after="20" w:line="240" w:lineRule="auto"/>
+              <w:jc w:val="center"/>
+              <w:suppressAutoHyphens/>
+              <w:keepNext w:val="0"/>
+              <w:keepLines/>
+              <w:widowControl w:val="1"/>
+            </w:pPr>
+            <w:r>
+              <w:rPr>
+                <w:rFonts w:ascii="Times New Roman" w:hAnsi="Times New Roman"/>
+                <w:sz w:val="18"/>
+              </w:rPr>
+              <w:t xml:space="preserve">0.24</w:t>
+            </w:r>
+          </w:p>
+        </w:tc>
+        <w:tc>
+          <w:tcPr>
+            <w:tcBorders>
+              <w:left w:val="nil"/>
+              <w:right w:val="nil"/>
+              <w:top w:val="nil"/>
+              <w:bottom w:val="single" w:sz="4" w:color="D9E1E8"/>
+            </w:tcBorders>
+            <w:vAlign w:val="center"/>
+          </w:tcPr>
+          <w:p>
+            <w:pPr>
+              <w:pStyle w:val="Compact"/>
+              <w:spacing w:before="0" w:after="20" w:line="240" w:lineRule="auto"/>
+              <w:jc w:val="center"/>
+              <w:suppressAutoHyphens/>
+              <w:keepNext w:val="0"/>
+              <w:keepLines/>
+              <w:widowControl w:val="1"/>
+            </w:pPr>
+            <w:r>
+              <w:rPr>
+                <w:rFonts w:ascii="Times New Roman" w:hAnsi="Times New Roman"/>
+                <w:sz w:val="18"/>
+              </w:rPr>
+              <w:t xml:space="preserve">-0.07</w:t>
+            </w:r>
+          </w:p>
+        </w:tc>
+        <w:tc>
+          <w:tcPr>
+            <w:tcBorders>
+              <w:left w:val="nil"/>
+              <w:right w:val="nil"/>
+              <w:top w:val="nil"/>
+              <w:bottom w:val="single" w:sz="4" w:color="D9E1E8"/>
+            </w:tcBorders>
+            <w:vAlign w:val="center"/>
+          </w:tcPr>
+          <w:p>
+            <w:pPr>
+              <w:pStyle w:val="Compact"/>
+              <w:spacing w:before="0" w:after="20" w:line="240" w:lineRule="auto"/>
+              <w:jc w:val="center"/>
+              <w:suppressAutoHyphens/>
+              <w:keepNext w:val="0"/>
+              <w:keepLines/>
+              <w:widowControl w:val="1"/>
+            </w:pPr>
+            <w:r>
+              <w:rPr>
+                <w:rFonts w:ascii="Times New Roman" w:hAnsi="Times New Roman"/>
+                <w:sz w:val="18"/>
+              </w:rPr>
+              <w:t xml:space="preserve">-0.07</w:t>
+            </w:r>
+          </w:p>
+        </w:tc>
+        <w:tc>
+          <w:tcPr>
+            <w:tcBorders>
+              <w:left w:val="nil"/>
+              <w:right w:val="nil"/>
+              <w:top w:val="nil"/>
+              <w:bottom w:val="single" w:sz="4" w:color="D9E1E8"/>
+            </w:tcBorders>
+            <w:vAlign w:val="center"/>
+          </w:tcPr>
+          <w:p>
+            <w:pPr>
+              <w:pStyle w:val="Compact"/>
+              <w:spacing w:before="0" w:after="20" w:line="240" w:lineRule="auto"/>
+              <w:jc w:val="center"/>
+              <w:suppressAutoHyphens/>
+              <w:keepNext w:val="0"/>
+              <w:keepLines/>
+              <w:widowControl w:val="1"/>
+            </w:pPr>
+            <w:r>
+              <w:rPr>
+                <w:rFonts w:ascii="Times New Roman" w:hAnsi="Times New Roman"/>
+                <w:sz w:val="18"/>
+              </w:rPr>
+              <w:t xml:space="preserve">0.82</w:t>
+            </w:r>
+          </w:p>
+        </w:tc>
+        <w:tc>
+          <w:tcPr>
+            <w:tcBorders>
+              <w:left w:val="nil"/>
+              <w:right w:val="nil"/>
+              <w:top w:val="nil"/>
+              <w:bottom w:val="single" w:sz="4" w:color="D9E1E8"/>
+            </w:tcBorders>
+            <w:vAlign w:val="center"/>
+          </w:tcPr>
+          <w:p>
+            <w:pPr>
+              <w:pStyle w:val="Compact"/>
+              <w:spacing w:before="0" w:after="20" w:line="240" w:lineRule="auto"/>
+              <w:jc w:val="center"/>
+              <w:suppressAutoHyphens/>
+              <w:keepNext w:val="0"/>
+              <w:keepLines/>
+              <w:widowControl w:val="1"/>
+            </w:pPr>
+            <w:r>
+              <w:rPr>
+                <w:rFonts w:ascii="Times New Roman" w:hAnsi="Times New Roman"/>
+                <w:sz w:val="18"/>
+              </w:rPr>
+              <w:t xml:space="preserve">0.00</w:t>
+            </w:r>
+          </w:p>
+        </w:tc>
+        <w:tc>
+          <w:tcPr>
+            <w:tcBorders>
+              <w:left w:val="nil"/>
+              <w:right w:val="nil"/>
+              <w:top w:val="nil"/>
+              <w:bottom w:val="single" w:sz="4" w:color="D9E1E8"/>
+            </w:tcBorders>
+            <w:vAlign w:val="center"/>
+          </w:tcPr>
+          <w:p>
+            <w:pPr>
+              <w:pStyle w:val="Compact"/>
+              <w:spacing w:before="0" w:after="20" w:line="240" w:lineRule="auto"/>
+              <w:jc w:val="center"/>
+              <w:suppressAutoHyphens/>
+              <w:keepNext w:val="0"/>
+              <w:keepLines/>
+              <w:widowControl w:val="1"/>
+            </w:pPr>
+            <w:r>
+              <w:rPr>
+                <w:rFonts w:ascii="Times New Roman" w:hAnsi="Times New Roman"/>
+                <w:sz w:val="18"/>
+              </w:rPr>
+              <w:t xml:space="preserve">-0.07</w:t>
+            </w:r>
+          </w:p>
+        </w:tc>
+      </w:tr>
+      <w:tr>
+        <w:tc>
+          <w:tcPr>
+            <w:tcBorders>
+              <w:left w:val="nil"/>
+              <w:right w:val="nil"/>
+              <w:top w:val="nil"/>
+              <w:bottom w:val="single" w:sz="4" w:color="D9E1E8"/>
+            </w:tcBorders>
+            <w:vAlign w:val="center"/>
+          </w:tcPr>
+          <w:p>
+            <w:pPr>
+              <w:pStyle w:val="Compact"/>
+              <w:spacing w:before="0" w:after="20" w:line="240" w:lineRule="auto"/>
+              <w:jc w:val="center"/>
+              <w:suppressAutoHyphens/>
+              <w:keepNext w:val="0"/>
+              <w:keepLines/>
+              <w:widowControl w:val="1"/>
+            </w:pPr>
+            <w:r>
+              <w:rPr>
+                <w:rFonts w:ascii="Times New Roman" w:hAnsi="Times New Roman"/>
+                <w:sz w:val="18"/>
+              </w:rPr>
+              <w:t xml:space="preserve">always-LOF</w:t>
+            </w:r>
+          </w:p>
+        </w:tc>
+        <w:tc>
+          <w:tcPr>
+            <w:tcBorders>
+              <w:left w:val="nil"/>
+              <w:right w:val="nil"/>
+              <w:top w:val="nil"/>
+              <w:bottom w:val="single" w:sz="4" w:color="D9E1E8"/>
+            </w:tcBorders>
+            <w:vAlign w:val="center"/>
+          </w:tcPr>
+          <w:p>
+            <w:pPr>
+              <w:pStyle w:val="Compact"/>
+              <w:spacing w:before="0" w:after="20" w:line="240" w:lineRule="auto"/>
+              <w:jc w:val="center"/>
+              <w:suppressAutoHyphens/>
+              <w:keepNext w:val="0"/>
+              <w:keepLines/>
+              <w:widowControl w:val="1"/>
+            </w:pPr>
+            <w:r>
+              <w:rPr>
+                <w:rFonts w:ascii="Times New Roman" w:hAnsi="Times New Roman"/>
+                <w:sz w:val="18"/>
+              </w:rPr>
+              <w:t xml:space="preserve">0.21</w:t>
+            </w:r>
+          </w:p>
+        </w:tc>
+        <w:tc>
+          <w:tcPr>
+            <w:tcBorders>
+              <w:left w:val="nil"/>
+              <w:right w:val="nil"/>
+              <w:top w:val="nil"/>
+              <w:bottom w:val="single" w:sz="4" w:color="D9E1E8"/>
+            </w:tcBorders>
+            <w:vAlign w:val="center"/>
+          </w:tcPr>
+          <w:p>
+            <w:pPr>
+              <w:pStyle w:val="Compact"/>
+              <w:spacing w:before="0" w:after="20" w:line="240" w:lineRule="auto"/>
+              <w:jc w:val="center"/>
+              <w:suppressAutoHyphens/>
+              <w:keepNext w:val="0"/>
+              <w:keepLines/>
+              <w:widowControl w:val="1"/>
+            </w:pPr>
+            <w:r>
+              <w:rPr>
+                <w:rFonts w:ascii="Times New Roman" w:hAnsi="Times New Roman"/>
+                <w:sz w:val="18"/>
+              </w:rPr>
+              <w:t xml:space="preserve">0.70</w:t>
+            </w:r>
+          </w:p>
+        </w:tc>
+        <w:tc>
+          <w:tcPr>
+            <w:tcBorders>
+              <w:left w:val="nil"/>
+              <w:right w:val="nil"/>
+              <w:top w:val="nil"/>
+              <w:bottom w:val="single" w:sz="4" w:color="D9E1E8"/>
+            </w:tcBorders>
+            <w:vAlign w:val="center"/>
+          </w:tcPr>
+          <w:p>
+            <w:pPr>
+              <w:pStyle w:val="Compact"/>
+              <w:spacing w:before="0" w:after="20" w:line="240" w:lineRule="auto"/>
+              <w:jc w:val="center"/>
+              <w:suppressAutoHyphens/>
+              <w:keepNext w:val="0"/>
+              <w:keepLines/>
+              <w:widowControl w:val="1"/>
+            </w:pPr>
+            <w:r>
+              <w:rPr>
+                <w:rFonts w:ascii="Times New Roman" w:hAnsi="Times New Roman"/>
+                <w:sz w:val="18"/>
+              </w:rPr>
+              <w:t xml:space="preserve">0.93</w:t>
+            </w:r>
+          </w:p>
+        </w:tc>
+        <w:tc>
+          <w:tcPr>
+            <w:tcBorders>
+              <w:left w:val="nil"/>
+              <w:right w:val="nil"/>
+              <w:top w:val="nil"/>
+              <w:bottom w:val="single" w:sz="4" w:color="D9E1E8"/>
+            </w:tcBorders>
+            <w:vAlign w:val="center"/>
+          </w:tcPr>
+          <w:p>
+            <w:pPr>
+              <w:pStyle w:val="Compact"/>
+              <w:spacing w:before="0" w:after="20" w:line="240" w:lineRule="auto"/>
+              <w:jc w:val="center"/>
+              <w:suppressAutoHyphens/>
+              <w:keepNext w:val="0"/>
+              <w:keepLines/>
+              <w:widowControl w:val="1"/>
+            </w:pPr>
+            <w:r>
+              <w:rPr>
+                <w:rFonts w:ascii="Times New Roman" w:hAnsi="Times New Roman"/>
+                <w:sz w:val="18"/>
+              </w:rPr>
+              <w:t xml:space="preserve">0.93</w:t>
+            </w:r>
+          </w:p>
+        </w:tc>
+        <w:tc>
+          <w:tcPr>
+            <w:tcBorders>
+              <w:left w:val="nil"/>
+              <w:right w:val="nil"/>
+              <w:top w:val="nil"/>
+              <w:bottom w:val="single" w:sz="4" w:color="D9E1E8"/>
+            </w:tcBorders>
+            <w:vAlign w:val="center"/>
+          </w:tcPr>
+          <w:p>
+            <w:pPr>
+              <w:pStyle w:val="Compact"/>
+              <w:spacing w:before="0" w:after="20" w:line="240" w:lineRule="auto"/>
+              <w:jc w:val="center"/>
+              <w:suppressAutoHyphens/>
+              <w:keepNext w:val="0"/>
+              <w:keepLines/>
+              <w:widowControl w:val="1"/>
+            </w:pPr>
+            <w:r>
+              <w:rPr>
+                <w:rFonts w:ascii="Times New Roman" w:hAnsi="Times New Roman"/>
+                <w:sz w:val="18"/>
+              </w:rPr>
+              <w:t xml:space="preserve">0.92</w:t>
+            </w:r>
+          </w:p>
+        </w:tc>
+        <w:tc>
+          <w:tcPr>
+            <w:tcBorders>
+              <w:left w:val="nil"/>
+              <w:right w:val="nil"/>
+              <w:top w:val="nil"/>
+              <w:bottom w:val="single" w:sz="4" w:color="D9E1E8"/>
+            </w:tcBorders>
+            <w:vAlign w:val="center"/>
+          </w:tcPr>
+          <w:p>
+            <w:pPr>
+              <w:pStyle w:val="Compact"/>
+              <w:spacing w:before="0" w:after="20" w:line="240" w:lineRule="auto"/>
+              <w:jc w:val="center"/>
+              <w:suppressAutoHyphens/>
+              <w:keepNext w:val="0"/>
+              <w:keepLines/>
+              <w:widowControl w:val="1"/>
+            </w:pPr>
+            <w:r>
+              <w:rPr>
+                <w:rFonts w:ascii="Times New Roman" w:hAnsi="Times New Roman"/>
+                <w:sz w:val="18"/>
+              </w:rPr>
+              <w:t xml:space="preserve">0.55</w:t>
+            </w:r>
+          </w:p>
+        </w:tc>
+        <w:tc>
+          <w:tcPr>
+            <w:tcBorders>
+              <w:left w:val="nil"/>
+              <w:right w:val="nil"/>
+              <w:top w:val="nil"/>
+              <w:bottom w:val="single" w:sz="4" w:color="D9E1E8"/>
+            </w:tcBorders>
+            <w:vAlign w:val="center"/>
+          </w:tcPr>
+          <w:p>
+            <w:pPr>
+              <w:pStyle w:val="Compact"/>
+              <w:spacing w:before="0" w:after="20" w:line="240" w:lineRule="auto"/>
+              <w:jc w:val="center"/>
+              <w:suppressAutoHyphens/>
+              <w:keepNext w:val="0"/>
+              <w:keepLines/>
+              <w:widowControl w:val="1"/>
+            </w:pPr>
+            <w:r>
+              <w:rPr>
+                <w:rFonts w:ascii="Times New Roman" w:hAnsi="Times New Roman"/>
+                <w:sz w:val="18"/>
+              </w:rPr>
+              <w:t xml:space="preserve">0.21</w:t>
+            </w:r>
+          </w:p>
+        </w:tc>
+      </w:tr>
+      <w:tr>
+        <w:tc>
+          <w:tcPr>
+            <w:tcBorders>
+              <w:left w:val="nil"/>
+              <w:right w:val="nil"/>
+              <w:top w:val="nil"/>
+              <w:bottom w:val="single" w:sz="4" w:color="D9E1E8"/>
+            </w:tcBorders>
+            <w:vAlign w:val="center"/>
+          </w:tcPr>
+          <w:p>
+            <w:pPr>
+              <w:pStyle w:val="Compact"/>
+              <w:spacing w:before="0" w:after="20" w:line="240" w:lineRule="auto"/>
+              <w:jc w:val="center"/>
+              <w:suppressAutoHyphens/>
+              <w:keepNext w:val="0"/>
+              <w:keepLines/>
+              <w:widowControl w:val="1"/>
+            </w:pPr>
+            <w:r>
+              <w:rPr>
+                <w:rFonts w:ascii="Times New Roman" w:hAnsi="Times New Roman"/>
+                <w:sz w:val="18"/>
+              </w:rPr>
+              <w:t xml:space="preserve">always-KNN</w:t>
+            </w:r>
+          </w:p>
+        </w:tc>
+        <w:tc>
+          <w:tcPr>
+            <w:tcBorders>
+              <w:left w:val="nil"/>
+              <w:right w:val="nil"/>
+              <w:top w:val="nil"/>
+              <w:bottom w:val="single" w:sz="4" w:color="D9E1E8"/>
+            </w:tcBorders>
+            <w:vAlign w:val="center"/>
+          </w:tcPr>
+          <w:p>
+            <w:pPr>
+              <w:pStyle w:val="Compact"/>
+              <w:spacing w:before="0" w:after="20" w:line="240" w:lineRule="auto"/>
+              <w:jc w:val="center"/>
+              <w:suppressAutoHyphens/>
+              <w:keepNext w:val="0"/>
+              <w:keepLines/>
+              <w:widowControl w:val="1"/>
+            </w:pPr>
+            <w:r>
+              <w:rPr>
+                <w:rFonts w:ascii="Times New Roman" w:hAnsi="Times New Roman"/>
+                <w:sz w:val="18"/>
+              </w:rPr>
+              <w:t xml:space="preserve">0.23</w:t>
+            </w:r>
+          </w:p>
+        </w:tc>
+        <w:tc>
+          <w:tcPr>
+            <w:tcBorders>
+              <w:left w:val="nil"/>
+              <w:right w:val="nil"/>
+              <w:top w:val="nil"/>
+              <w:bottom w:val="single" w:sz="4" w:color="D9E1E8"/>
+            </w:tcBorders>
+            <w:vAlign w:val="center"/>
+          </w:tcPr>
+          <w:p>
+            <w:pPr>
+              <w:pStyle w:val="Compact"/>
+              <w:spacing w:before="0" w:after="20" w:line="240" w:lineRule="auto"/>
+              <w:jc w:val="center"/>
+              <w:suppressAutoHyphens/>
+              <w:keepNext w:val="0"/>
+              <w:keepLines/>
+              <w:widowControl w:val="1"/>
+            </w:pPr>
+            <w:r>
+              <w:rPr>
+                <w:rFonts w:ascii="Times New Roman" w:hAnsi="Times New Roman"/>
+                <w:sz w:val="18"/>
+              </w:rPr>
+              <w:t xml:space="preserve">0.64</w:t>
+            </w:r>
+          </w:p>
+        </w:tc>
+        <w:tc>
+          <w:tcPr>
+            <w:tcBorders>
+              <w:left w:val="nil"/>
+              <w:right w:val="nil"/>
+              <w:top w:val="nil"/>
+              <w:bottom w:val="single" w:sz="4" w:color="D9E1E8"/>
+            </w:tcBorders>
+            <w:vAlign w:val="center"/>
+          </w:tcPr>
+          <w:p>
+            <w:pPr>
+              <w:pStyle w:val="Compact"/>
+              <w:spacing w:before="0" w:after="20" w:line="240" w:lineRule="auto"/>
+              <w:jc w:val="center"/>
+              <w:suppressAutoHyphens/>
+              <w:keepNext w:val="0"/>
+              <w:keepLines/>
+              <w:widowControl w:val="1"/>
+            </w:pPr>
+            <w:r>
+              <w:rPr>
+                <w:rFonts w:ascii="Times New Roman" w:hAnsi="Times New Roman"/>
+                <w:sz w:val="18"/>
+              </w:rPr>
+              <w:t xml:space="preserve">0.65</w:t>
+            </w:r>
+          </w:p>
+        </w:tc>
+        <w:tc>
+          <w:tcPr>
+            <w:tcBorders>
+              <w:left w:val="nil"/>
+              <w:right w:val="nil"/>
+              <w:top w:val="nil"/>
+              <w:bottom w:val="single" w:sz="4" w:color="D9E1E8"/>
+            </w:tcBorders>
+            <w:vAlign w:val="center"/>
+          </w:tcPr>
+          <w:p>
+            <w:pPr>
+              <w:pStyle w:val="Compact"/>
+              <w:spacing w:before="0" w:after="20" w:line="240" w:lineRule="auto"/>
+              <w:jc w:val="center"/>
+              <w:suppressAutoHyphens/>
+              <w:keepNext w:val="0"/>
+              <w:keepLines/>
+              <w:widowControl w:val="1"/>
+            </w:pPr>
+            <w:r>
+              <w:rPr>
+                <w:rFonts w:ascii="Times New Roman" w:hAnsi="Times New Roman"/>
+                <w:sz w:val="18"/>
+              </w:rPr>
+              <w:t xml:space="preserve">0.39</w:t>
+            </w:r>
+          </w:p>
+        </w:tc>
+        <w:tc>
+          <w:tcPr>
+            <w:tcBorders>
+              <w:left w:val="nil"/>
+              <w:right w:val="nil"/>
+              <w:top w:val="nil"/>
+              <w:bottom w:val="single" w:sz="4" w:color="D9E1E8"/>
+            </w:tcBorders>
+            <w:vAlign w:val="center"/>
+          </w:tcPr>
+          <w:p>
+            <w:pPr>
+              <w:pStyle w:val="Compact"/>
+              <w:spacing w:before="0" w:after="20" w:line="240" w:lineRule="auto"/>
+              <w:jc w:val="center"/>
+              <w:suppressAutoHyphens/>
+              <w:keepNext w:val="0"/>
+              <w:keepLines/>
+              <w:widowControl w:val="1"/>
+            </w:pPr>
+            <w:r>
+              <w:rPr>
+                <w:rFonts w:ascii="Times New Roman" w:hAnsi="Times New Roman"/>
+                <w:sz w:val="18"/>
+              </w:rPr>
+              <w:t xml:space="preserve">0.91</w:t>
+            </w:r>
+          </w:p>
+        </w:tc>
+        <w:tc>
+          <w:tcPr>
+            <w:tcBorders>
+              <w:left w:val="nil"/>
+              <w:right w:val="nil"/>
+              <w:top w:val="nil"/>
+              <w:bottom w:val="single" w:sz="4" w:color="D9E1E8"/>
+            </w:tcBorders>
+            <w:vAlign w:val="center"/>
+          </w:tcPr>
+          <w:p>
+            <w:pPr>
+              <w:pStyle w:val="Compact"/>
+              <w:spacing w:before="0" w:after="20" w:line="240" w:lineRule="auto"/>
+              <w:jc w:val="center"/>
+              <w:suppressAutoHyphens/>
+              <w:keepNext w:val="0"/>
+              <w:keepLines/>
+              <w:widowControl w:val="1"/>
+            </w:pPr>
+            <w:r>
+              <w:rPr>
+                <w:rFonts w:ascii="Times New Roman" w:hAnsi="Times New Roman"/>
+                <w:sz w:val="18"/>
+              </w:rPr>
+              <w:t xml:space="preserve">0.36</w:t>
+            </w:r>
+          </w:p>
+        </w:tc>
+        <w:tc>
+          <w:tcPr>
+            <w:tcBorders>
+              <w:left w:val="nil"/>
+              <w:right w:val="nil"/>
+              <w:top w:val="nil"/>
+              <w:bottom w:val="single" w:sz="4" w:color="D9E1E8"/>
+            </w:tcBorders>
+            <w:vAlign w:val="center"/>
+          </w:tcPr>
+          <w:p>
+            <w:pPr>
+              <w:pStyle w:val="Compact"/>
+              <w:spacing w:before="0" w:after="20" w:line="240" w:lineRule="auto"/>
+              <w:jc w:val="center"/>
+              <w:suppressAutoHyphens/>
+              <w:keepNext w:val="0"/>
+              <w:keepLines/>
+              <w:widowControl w:val="1"/>
+            </w:pPr>
+            <w:r>
+              <w:rPr>
+                <w:rFonts w:ascii="Times New Roman" w:hAnsi="Times New Roman"/>
+                <w:sz w:val="18"/>
+              </w:rPr>
+              <w:t xml:space="preserve">0.23</w:t>
+            </w:r>
+          </w:p>
+        </w:tc>
+      </w:tr>
+      <w:tr>
+        <w:tc>
+          <w:tcPr>
+            <w:tcBorders>
+              <w:left w:val="nil"/>
+              <w:right w:val="nil"/>
+              <w:top w:val="nil"/>
+              <w:bottom w:val="single" w:sz="4" w:color="D9E1E8"/>
+            </w:tcBorders>
+            <w:vAlign w:val="center"/>
+          </w:tcPr>
+          <w:p>
+            <w:pPr>
+              <w:pStyle w:val="Compact"/>
+              <w:spacing w:before="0" w:after="20" w:line="240" w:lineRule="auto"/>
+              <w:jc w:val="center"/>
+              <w:suppressAutoHyphens/>
+              <w:keepNext w:val="0"/>
+              <w:keepLines/>
+              <w:widowControl w:val="1"/>
+            </w:pPr>
+            <w:r>
+              <w:rPr>
+                <w:rFonts w:ascii="Times New Roman" w:hAnsi="Times New Roman"/>
+                <w:sz w:val="18"/>
+              </w:rPr>
+              <w:t xml:space="preserve">EM [1]</w:t>
+            </w:r>
+          </w:p>
+        </w:tc>
+        <w:tc>
+          <w:tcPr>
+            <w:tcBorders>
+              <w:left w:val="nil"/>
+              <w:right w:val="nil"/>
+              <w:top w:val="nil"/>
+              <w:bottom w:val="single" w:sz="4" w:color="D9E1E8"/>
+            </w:tcBorders>
+            <w:vAlign w:val="center"/>
+          </w:tcPr>
+          <w:p>
+            <w:pPr>
+              <w:pStyle w:val="Compact"/>
+              <w:spacing w:before="0" w:after="20" w:line="240" w:lineRule="auto"/>
+              <w:jc w:val="center"/>
+              <w:suppressAutoHyphens/>
+              <w:keepNext w:val="0"/>
+              <w:keepLines/>
+              <w:widowControl w:val="1"/>
+            </w:pPr>
+            <w:r>
+              <w:rPr>
+                <w:rFonts w:ascii="Times New Roman" w:hAnsi="Times New Roman"/>
+                <w:sz w:val="18"/>
+              </w:rPr>
+              <w:t xml:space="preserve">—</w:t>
+            </w:r>
+          </w:p>
+        </w:tc>
+        <w:tc>
+          <w:tcPr>
+            <w:tcBorders>
+              <w:left w:val="nil"/>
+              <w:right w:val="nil"/>
+              <w:top w:val="nil"/>
+              <w:bottom w:val="single" w:sz="4" w:color="D9E1E8"/>
+            </w:tcBorders>
+            <w:vAlign w:val="center"/>
+          </w:tcPr>
+          <w:p>
+            <w:pPr>
+              <w:pStyle w:val="Compact"/>
+              <w:spacing w:before="0" w:after="20" w:line="240" w:lineRule="auto"/>
+              <w:jc w:val="center"/>
+              <w:suppressAutoHyphens/>
+              <w:keepNext w:val="0"/>
+              <w:keepLines/>
+              <w:widowControl w:val="1"/>
+            </w:pPr>
+            <w:r>
+              <w:rPr>
+                <w:rFonts w:ascii="Times New Roman" w:hAnsi="Times New Roman"/>
+                <w:sz w:val="18"/>
+              </w:rPr>
+              <w:t xml:space="preserve">0.68</w:t>
+            </w:r>
+          </w:p>
+        </w:tc>
+        <w:tc>
+          <w:tcPr>
+            <w:tcBorders>
+              <w:left w:val="nil"/>
+              <w:right w:val="nil"/>
+              <w:top w:val="nil"/>
+              <w:bottom w:val="single" w:sz="4" w:color="D9E1E8"/>
+            </w:tcBorders>
+            <w:vAlign w:val="center"/>
+          </w:tcPr>
+          <w:p>
+            <w:pPr>
+              <w:pStyle w:val="Compact"/>
+              <w:spacing w:before="0" w:after="20" w:line="240" w:lineRule="auto"/>
+              <w:jc w:val="center"/>
+              <w:suppressAutoHyphens/>
+              <w:keepNext w:val="0"/>
+              <w:keepLines/>
+              <w:widowControl w:val="1"/>
+            </w:pPr>
+            <w:r>
+              <w:rPr>
+                <w:rFonts w:ascii="Times New Roman" w:hAnsi="Times New Roman"/>
+                <w:sz w:val="18"/>
+              </w:rPr>
+              <w:t xml:space="preserve">-0.07</w:t>
+            </w:r>
+          </w:p>
+        </w:tc>
+        <w:tc>
+          <w:tcPr>
+            <w:tcBorders>
+              <w:left w:val="nil"/>
+              <w:right w:val="nil"/>
+              <w:top w:val="nil"/>
+              <w:bottom w:val="single" w:sz="4" w:color="D9E1E8"/>
+            </w:tcBorders>
+            <w:vAlign w:val="center"/>
+          </w:tcPr>
+          <w:p>
+            <w:pPr>
+              <w:pStyle w:val="Compact"/>
+              <w:spacing w:before="0" w:after="20" w:line="240" w:lineRule="auto"/>
+              <w:jc w:val="center"/>
+              <w:suppressAutoHyphens/>
+              <w:keepNext w:val="0"/>
+              <w:keepLines/>
+              <w:widowControl w:val="1"/>
+            </w:pPr>
+            <w:r>
+              <w:rPr>
+                <w:rFonts w:ascii="Times New Roman" w:hAnsi="Times New Roman"/>
+                <w:sz w:val="18"/>
+              </w:rPr>
+              <w:t xml:space="preserve">0.89</w:t>
+            </w:r>
+          </w:p>
+        </w:tc>
+        <w:tc>
+          <w:tcPr>
+            <w:tcBorders>
+              <w:left w:val="nil"/>
+              <w:right w:val="nil"/>
+              <w:top w:val="nil"/>
+              <w:bottom w:val="single" w:sz="4" w:color="D9E1E8"/>
+            </w:tcBorders>
+            <w:vAlign w:val="center"/>
+          </w:tcPr>
+          <w:p>
+            <w:pPr>
+              <w:pStyle w:val="Compact"/>
+              <w:spacing w:before="0" w:after="20" w:line="240" w:lineRule="auto"/>
+              <w:jc w:val="center"/>
+              <w:suppressAutoHyphens/>
+              <w:keepNext w:val="0"/>
+              <w:keepLines/>
+              <w:widowControl w:val="1"/>
+            </w:pPr>
+            <w:r>
+              <w:rPr>
+                <w:rFonts w:ascii="Times New Roman" w:hAnsi="Times New Roman"/>
+                <w:sz w:val="18"/>
+              </w:rPr>
+              <w:t xml:space="preserve">0.71</w:t>
+            </w:r>
+          </w:p>
+        </w:tc>
+        <w:tc>
+          <w:tcPr>
+            <w:tcBorders>
+              <w:left w:val="nil"/>
+              <w:right w:val="nil"/>
+              <w:top w:val="nil"/>
+              <w:bottom w:val="single" w:sz="4" w:color="D9E1E8"/>
+            </w:tcBorders>
+            <w:vAlign w:val="center"/>
+          </w:tcPr>
+          <w:p>
+            <w:pPr>
+              <w:pStyle w:val="Compact"/>
+              <w:spacing w:before="0" w:after="20" w:line="240" w:lineRule="auto"/>
+              <w:jc w:val="center"/>
+              <w:suppressAutoHyphens/>
+              <w:keepNext w:val="0"/>
+              <w:keepLines/>
+              <w:widowControl w:val="1"/>
+            </w:pPr>
+            <w:r>
+              <w:rPr>
+                <w:rFonts w:ascii="Times New Roman" w:hAnsi="Times New Roman"/>
+                <w:sz w:val="18"/>
+              </w:rPr>
+              <w:t xml:space="preserve">-0.11</w:t>
+            </w:r>
+          </w:p>
+        </w:tc>
+        <w:tc>
+          <w:tcPr>
+            <w:tcBorders>
+              <w:left w:val="nil"/>
+              <w:right w:val="nil"/>
+              <w:top w:val="nil"/>
+              <w:bottom w:val="single" w:sz="4" w:color="D9E1E8"/>
+            </w:tcBorders>
+            <w:vAlign w:val="center"/>
+          </w:tcPr>
+          <w:p>
+            <w:pPr>
+              <w:pStyle w:val="Compact"/>
+              <w:spacing w:before="0" w:after="20" w:line="240" w:lineRule="auto"/>
+              <w:jc w:val="center"/>
+              <w:suppressAutoHyphens/>
+              <w:keepNext w:val="0"/>
+              <w:keepLines/>
+              <w:widowControl w:val="1"/>
+            </w:pPr>
+            <w:r>
+              <w:rPr>
+                <w:rFonts w:ascii="Times New Roman" w:hAnsi="Times New Roman"/>
+                <w:sz w:val="18"/>
+              </w:rPr>
+              <w:t xml:space="preserve">-0.11</w:t>
+            </w:r>
+          </w:p>
+        </w:tc>
+      </w:tr>
+      <w:tr>
+        <w:tc>
+          <w:tcPr>
+            <w:tcBorders>
+              <w:left w:val="nil"/>
+              <w:right w:val="nil"/>
+              <w:top w:val="nil"/>
+              <w:bottom w:val="nil"/>
+            </w:tcBorders>
+            <w:vAlign w:val="center"/>
+          </w:tcPr>
+          <w:p>
+            <w:pPr>
+              <w:pStyle w:val="Compact"/>
+              <w:spacing w:before="0" w:after="20" w:line="240" w:lineRule="auto"/>
+              <w:jc w:val="center"/>
+              <w:suppressAutoHyphens/>
+              <w:keepNext w:val="0"/>
+              <w:keepLines/>
+              <w:widowControl w:val="1"/>
+            </w:pPr>
+            <w:r>
+              <w:rPr>
+                <w:rFonts w:ascii="Times New Roman" w:hAnsi="Times New Roman"/>
+                <w:sz w:val="18"/>
+              </w:rPr>
+              <w:t xml:space="preserve">MV [1]</w:t>
+            </w:r>
+          </w:p>
+        </w:tc>
+        <w:tc>
+          <w:tcPr>
+            <w:tcBorders>
+              <w:left w:val="nil"/>
+              <w:right w:val="nil"/>
+              <w:top w:val="nil"/>
+              <w:bottom w:val="nil"/>
+            </w:tcBorders>
+            <w:vAlign w:val="center"/>
+          </w:tcPr>
+          <w:p>
+            <w:pPr>
+              <w:pStyle w:val="Compact"/>
+              <w:spacing w:before="0" w:after="20" w:line="240" w:lineRule="auto"/>
+              <w:jc w:val="center"/>
+              <w:suppressAutoHyphens/>
+              <w:keepNext w:val="0"/>
+              <w:keepLines/>
+              <w:widowControl w:val="1"/>
+            </w:pPr>
+            <w:r>
+              <w:rPr>
+                <w:rFonts w:ascii="Times New Roman" w:hAnsi="Times New Roman"/>
+                <w:sz w:val="18"/>
+              </w:rPr>
+              <w:t xml:space="preserve">—</w:t>
+            </w:r>
+          </w:p>
+        </w:tc>
+        <w:tc>
+          <w:tcPr>
+            <w:tcBorders>
+              <w:left w:val="nil"/>
+              <w:right w:val="nil"/>
+              <w:top w:val="nil"/>
+              <w:bottom w:val="nil"/>
+            </w:tcBorders>
+            <w:vAlign w:val="center"/>
+          </w:tcPr>
+          <w:p>
+            <w:pPr>
+              <w:pStyle w:val="Compact"/>
+              <w:spacing w:before="0" w:after="20" w:line="240" w:lineRule="auto"/>
+              <w:jc w:val="center"/>
+              <w:suppressAutoHyphens/>
+              <w:keepNext w:val="0"/>
+              <w:keepLines/>
+              <w:widowControl w:val="1"/>
+            </w:pPr>
+            <w:r>
+              <w:rPr>
+                <w:rFonts w:ascii="Times New Roman" w:hAnsi="Times New Roman"/>
+                <w:sz w:val="18"/>
+              </w:rPr>
+              <w:t xml:space="preserve">0.66</w:t>
+            </w:r>
+          </w:p>
+        </w:tc>
+        <w:tc>
+          <w:tcPr>
+            <w:tcBorders>
+              <w:left w:val="nil"/>
+              <w:right w:val="nil"/>
+              <w:top w:val="nil"/>
+              <w:bottom w:val="nil"/>
+            </w:tcBorders>
+            <w:vAlign w:val="center"/>
+          </w:tcPr>
+          <w:p>
+            <w:pPr>
+              <w:pStyle w:val="Compact"/>
+              <w:spacing w:before="0" w:after="20" w:line="240" w:lineRule="auto"/>
+              <w:jc w:val="center"/>
+              <w:suppressAutoHyphens/>
+              <w:keepNext w:val="0"/>
+              <w:keepLines/>
+              <w:widowControl w:val="1"/>
+            </w:pPr>
+            <w:r>
+              <w:rPr>
+                <w:rFonts w:ascii="Times New Roman" w:hAnsi="Times New Roman"/>
+                <w:sz w:val="18"/>
+              </w:rPr>
+              <w:t xml:space="preserve">-0.07</w:t>
+            </w:r>
+          </w:p>
+        </w:tc>
+        <w:tc>
+          <w:tcPr>
+            <w:tcBorders>
+              <w:left w:val="nil"/>
+              <w:right w:val="nil"/>
+              <w:top w:val="nil"/>
+              <w:bottom w:val="nil"/>
+            </w:tcBorders>
+            <w:vAlign w:val="center"/>
+          </w:tcPr>
+          <w:p>
+            <w:pPr>
+              <w:pStyle w:val="Compact"/>
+              <w:spacing w:before="0" w:after="20" w:line="240" w:lineRule="auto"/>
+              <w:jc w:val="center"/>
+              <w:suppressAutoHyphens/>
+              <w:keepNext w:val="0"/>
+              <w:keepLines/>
+              <w:widowControl w:val="1"/>
+            </w:pPr>
+            <w:r>
+              <w:rPr>
+                <w:rFonts w:ascii="Times New Roman" w:hAnsi="Times New Roman"/>
+                <w:sz w:val="18"/>
+              </w:rPr>
+              <w:t xml:space="preserve">0.89</w:t>
+            </w:r>
+          </w:p>
+        </w:tc>
+        <w:tc>
+          <w:tcPr>
+            <w:tcBorders>
+              <w:left w:val="nil"/>
+              <w:right w:val="nil"/>
+              <w:top w:val="nil"/>
+              <w:bottom w:val="nil"/>
+            </w:tcBorders>
+            <w:vAlign w:val="center"/>
+          </w:tcPr>
+          <w:p>
+            <w:pPr>
+              <w:pStyle w:val="Compact"/>
+              <w:spacing w:before="0" w:after="20" w:line="240" w:lineRule="auto"/>
+              <w:jc w:val="center"/>
+              <w:suppressAutoHyphens/>
+              <w:keepNext w:val="0"/>
+              <w:keepLines/>
+              <w:widowControl w:val="1"/>
+            </w:pPr>
+            <w:r>
+              <w:rPr>
+                <w:rFonts w:ascii="Times New Roman" w:hAnsi="Times New Roman"/>
+                <w:sz w:val="18"/>
+              </w:rPr>
+              <w:t xml:space="preserve">0.76</w:t>
+            </w:r>
+          </w:p>
+        </w:tc>
+        <w:tc>
+          <w:tcPr>
+            <w:tcBorders>
+              <w:left w:val="nil"/>
+              <w:right w:val="nil"/>
+              <w:top w:val="nil"/>
+              <w:bottom w:val="nil"/>
+            </w:tcBorders>
+            <w:vAlign w:val="center"/>
+          </w:tcPr>
+          <w:p>
+            <w:pPr>
+              <w:pStyle w:val="Compact"/>
+              <w:spacing w:before="0" w:after="20" w:line="240" w:lineRule="auto"/>
+              <w:jc w:val="center"/>
+              <w:suppressAutoHyphens/>
+              <w:keepNext w:val="0"/>
+              <w:keepLines/>
+              <w:widowControl w:val="1"/>
+            </w:pPr>
+            <w:r>
+              <w:rPr>
+                <w:rFonts w:ascii="Times New Roman" w:hAnsi="Times New Roman"/>
+                <w:sz w:val="18"/>
+              </w:rPr>
+              <w:t xml:space="preserve">-0.26</w:t>
+            </w:r>
+          </w:p>
+        </w:tc>
+        <w:tc>
+          <w:tcPr>
+            <w:tcBorders>
+              <w:left w:val="nil"/>
+              <w:right w:val="nil"/>
+              <w:top w:val="nil"/>
+              <w:bottom w:val="nil"/>
+            </w:tcBorders>
+            <w:vAlign w:val="center"/>
+          </w:tcPr>
+          <w:p>
+            <w:pPr>
+              <w:pStyle w:val="Compact"/>
+              <w:spacing w:before="0" w:after="20" w:line="240" w:lineRule="auto"/>
+              <w:jc w:val="center"/>
+              <w:suppressAutoHyphens/>
+              <w:keepNext w:val="0"/>
+              <w:keepLines/>
+              <w:widowControl w:val="1"/>
+            </w:pPr>
+            <w:r>
+              <w:rPr>
+                <w:rFonts w:ascii="Times New Roman" w:hAnsi="Times New Roman"/>
+                <w:sz w:val="18"/>
+              </w:rPr>
+              <w:t xml:space="preserve">-0.26</w:t>
+            </w:r>
+          </w:p>
+        </w:tc>
+      </w:tr>
+    </w:tbl>
+    <w:p>
+      <w:pPr>
+        <w:pStyle w:val="TableCaption"/>
+        <w:spacing w:before="280" w:after="60" w:line="240" w:lineRule="auto"/>
+        <w:jc w:val="center"/>
+        <w:keepNext/>
+        <w:keepLines/>
+        <w:widowControl w:val="1"/>
+      </w:pPr>
+      <m:oMath>
+        <m:r>
+          <m:t>S</m:t>
+        </m:r>
+      </m:oMath>
+      <w:r>
+        <w:rPr>
+          <w:b/>
+          <w:i/>
+        </w:rPr>
+        <w:t>Table 9.</w:t>
+      </w:r>
+      <w:r>
+        <w:rPr>
+          <w:b w:val="0"/>
+          <w:i/>
+        </w:rPr>
+        <w:t xml:space="preserve"> </w:t>
+      </w:r>
+      <w:r>
+        <w:rPr>
+          <w:b w:val="0"/>
+          <w:i/>
+        </w:rPr>
+        <w:t>Selection skill  (pooled, Section 4; 1 = oracle, 0 = random, negative = worse than random) for each label-free strategy, computed on a common per-benchmark dataset panel so all methods are scored on identical datasets. "worst" is each method's minimum across the six benchmarks. ADRank has the highest worst-case skill; Isolation Forest and the EM/MV internal metrics each fall below random on at least one benchmark. EM/MV were not run on the external OddBench.</w:t>
       </w:r>
     </w:p>
     <w:bookmarkEnd w:id="34"/>

</xml_diff>

<commit_message>
Add professional two-column DOCX/PDF; four download badges (1-col + 2-col)
- Build a two-column camera-ready DOCX/PDF via the html2doc two-column profile
  (full-width title/abstract, two-column body, full-width table/figure floats).
  Render-verified: all 10 tables and 5 figures land as clean full-width floats,
  13 pages. adrank-2col.docx / adrank-2col.pdf.
- Fix the two-column caption-math displacement in Table 9 ("STable 9"): write the
  bare variable as <em>S</em> instead of $S$ in the caption (identical rendering,
  dodges the float displacement).
- Top-right badges now link all four downloads: PDF (1-col), PDF (2-col),
  Word (1-col), Word (2-col).
- 1-col rebuilt from the same source: adrank.docx (20 pp), adrank.pdf.

Co-Authored-By: Claude Opus 4.8 <noreply@anthropic.com>
</commit_message>
<xml_diff>
--- a/docs/adrank.docx
+++ b/docs/adrank.docx
@@ -15681,11 +15681,6 @@
         <w:keepLines/>
         <w:widowControl w:val="1"/>
       </w:pPr>
-      <m:oMath>
-        <m:r>
-          <m:t>S</m:t>
-        </m:r>
-      </m:oMath>
       <w:r>
         <w:rPr>
           <w:b/>
@@ -15705,7 +15700,7 @@
           <w:b w:val="0"/>
           <w:i/>
         </w:rPr>
-        <w:t>Selection skill  (pooled, Section 4; 1 = oracle, 0 = random, negative = worse than random) for each label-free strategy, computed on a common per-benchmark dataset panel so all methods are scored on identical datasets. "worst" is each method's minimum across the six benchmarks. ADRank has the highest worst-case skill; Isolation Forest and the EM/MV internal metrics each fall below random on at least one benchmark. EM/MV were not run on the external OddBench.</w:t>
+        <w:t>Selection skill S (pooled, Section 4; 1 = oracle, 0 = random, negative = worse than random) for each label-free strategy, computed on a common per-benchmark dataset panel so all methods are scored on identical datasets. "worst" is each method's minimum across the six benchmarks. ADRank has the highest worst-case skill; Isolation Forest and the EM/MV internal metrics each fall below random on at least one benchmark. EM/MV were not run on the external OddBench.</w:t>
       </w:r>
     </w:p>
     <w:bookmarkEnd w:id="34"/>

</xml_diff>